<commit_message>
4 шаг. AI (1)
</commit_message>
<xml_diff>
--- a/docs/архитектура с первого шага.docx
+++ b/docs/архитектура с первого шага.docx
@@ -1535,7 +1535,13 @@
         <w:t>)</w:t>
       </w:r>
     </w:p>
-    <w:p/>
+    <w:p>
+      <w:pPr>
+        <w:rPr>
+          <w:lang w:val="en-US"/>
+        </w:rPr>
+      </w:pPr>
+    </w:p>
     <w:p>
       <w:pPr>
         <w:rPr>
@@ -8589,6 +8595,1801 @@
       </w:r>
       <w:proofErr w:type="spellEnd"/>
       <w:r>
+        <w:t>.</w:t>
+      </w:r>
+    </w:p>
+    <w:p/>
+    <w:p>
+      <w:pPr>
+        <w:pStyle w:val="3"/>
+      </w:pPr>
+      <w:r>
+        <w:t>План — Шаг 4: AI (враг таранит игрока)</w:t>
+      </w:r>
+    </w:p>
+    <w:p/>
+    <w:p>
+      <w:r>
+        <w:t xml:space="preserve">Архитектурная развязка </w:t>
+      </w:r>
+      <w:proofErr w:type="spellStart"/>
+      <w:r>
+        <w:t>мультикара</w:t>
+      </w:r>
+      <w:proofErr w:type="spellEnd"/>
+      <w:r>
+        <w:t xml:space="preserve"> (минимально, без выброса кода)</w:t>
+      </w:r>
+    </w:p>
+    <w:p/>
+    <w:p>
+      <w:r>
+        <w:t xml:space="preserve">Блокеры, которые мы зафиксировали ранее: </w:t>
+      </w:r>
+      <w:proofErr w:type="spellStart"/>
+      <w:r>
+        <w:t>RegisterComponentInHierarchy</w:t>
+      </w:r>
+      <w:proofErr w:type="spellEnd"/>
+      <w:r>
+        <w:t>&lt;</w:t>
+      </w:r>
+      <w:proofErr w:type="spellStart"/>
+      <w:r>
+        <w:t>CarController</w:t>
+      </w:r>
+      <w:proofErr w:type="spellEnd"/>
+      <w:r>
+        <w:t xml:space="preserve">&gt;() </w:t>
+      </w:r>
+      <w:proofErr w:type="spellStart"/>
+      <w:r>
+        <w:t>инжектит</w:t>
+      </w:r>
+      <w:proofErr w:type="spellEnd"/>
+      <w:r>
+        <w:t xml:space="preserve"> только одну машину, а _</w:t>
+      </w:r>
+      <w:proofErr w:type="spellStart"/>
+      <w:r>
+        <w:t>carId</w:t>
+      </w:r>
+      <w:proofErr w:type="spellEnd"/>
+      <w:r>
+        <w:t xml:space="preserve"> у всех = 0 → коллизия ключей в </w:t>
+      </w:r>
+      <w:proofErr w:type="spellStart"/>
+      <w:r>
+        <w:t>DamageService</w:t>
+      </w:r>
+      <w:proofErr w:type="spellEnd"/>
+      <w:r>
+        <w:t xml:space="preserve">. Шагу 4 нужно ровно 2 машины. Решаю так, чтобы код не выкидывался при появлении </w:t>
+      </w:r>
+      <w:proofErr w:type="spellStart"/>
+      <w:r>
+        <w:t>CarFactory</w:t>
+      </w:r>
+      <w:proofErr w:type="spellEnd"/>
+      <w:r>
+        <w:t xml:space="preserve"> на шаге 5:</w:t>
+      </w:r>
+    </w:p>
+    <w:p/>
+    <w:p>
+      <w:r>
+        <w:t xml:space="preserve">1. </w:t>
+      </w:r>
+      <w:proofErr w:type="spellStart"/>
+      <w:r>
+        <w:t>Инжект</w:t>
+      </w:r>
+      <w:proofErr w:type="spellEnd"/>
+      <w:r>
+        <w:t xml:space="preserve"> каждой машины без фабрики. В </w:t>
+      </w:r>
+      <w:proofErr w:type="spellStart"/>
+      <w:r>
+        <w:t>GameLifetimeScope</w:t>
+      </w:r>
+      <w:proofErr w:type="spellEnd"/>
+      <w:r>
+        <w:t xml:space="preserve"> вместо одиночных </w:t>
+      </w:r>
+      <w:proofErr w:type="gramStart"/>
+      <w:r>
+        <w:t>RegisterComponentInHierarchy&lt;</w:t>
+      </w:r>
+      <w:proofErr w:type="gramEnd"/>
+      <w:r>
+        <w:t xml:space="preserve">CarController&gt;/&lt;CarDamageVisualController&gt; — </w:t>
+      </w:r>
+      <w:proofErr w:type="spellStart"/>
+      <w:r>
+        <w:t>сериализованный</w:t>
+      </w:r>
+      <w:proofErr w:type="spellEnd"/>
+      <w:r>
+        <w:t xml:space="preserve"> </w:t>
+      </w:r>
+      <w:proofErr w:type="spellStart"/>
+      <w:proofErr w:type="gramStart"/>
+      <w:r>
+        <w:t>GameObject</w:t>
+      </w:r>
+      <w:proofErr w:type="spellEnd"/>
+      <w:r>
+        <w:t>[</w:t>
+      </w:r>
+      <w:proofErr w:type="gramEnd"/>
+      <w:r>
+        <w:t>] _</w:t>
+      </w:r>
+      <w:proofErr w:type="spellStart"/>
+      <w:r>
+        <w:t>sceneCars</w:t>
+      </w:r>
+      <w:proofErr w:type="spellEnd"/>
+      <w:r>
+        <w:t xml:space="preserve"> + </w:t>
+      </w:r>
+      <w:proofErr w:type="spellStart"/>
+      <w:r>
+        <w:t>RegisterBuildCallback</w:t>
+      </w:r>
+      <w:proofErr w:type="spellEnd"/>
+      <w:r>
+        <w:t xml:space="preserve">, который вызывает </w:t>
+      </w:r>
+      <w:proofErr w:type="spellStart"/>
+      <w:proofErr w:type="gramStart"/>
+      <w:r>
+        <w:t>container.InjectGameObject</w:t>
+      </w:r>
+      <w:proofErr w:type="spellEnd"/>
+      <w:proofErr w:type="gramEnd"/>
+      <w:r>
+        <w:t>(</w:t>
+      </w:r>
+      <w:proofErr w:type="spellStart"/>
+      <w:r>
+        <w:t>go</w:t>
+      </w:r>
+      <w:proofErr w:type="spellEnd"/>
+      <w:r>
+        <w:t xml:space="preserve">) для каждой. Это </w:t>
+      </w:r>
+      <w:proofErr w:type="spellStart"/>
+      <w:r>
+        <w:t>инжектит</w:t>
+      </w:r>
+      <w:proofErr w:type="spellEnd"/>
+      <w:r>
+        <w:t xml:space="preserve"> обе машины целиком (</w:t>
+      </w:r>
+      <w:proofErr w:type="spellStart"/>
+      <w:r>
+        <w:t>CarController</w:t>
+      </w:r>
+      <w:proofErr w:type="spellEnd"/>
+      <w:r>
+        <w:t xml:space="preserve"> + </w:t>
+      </w:r>
+      <w:proofErr w:type="spellStart"/>
+      <w:r>
+        <w:t>EnemyCarController</w:t>
+      </w:r>
+      <w:proofErr w:type="spellEnd"/>
+      <w:r>
+        <w:t xml:space="preserve"> + </w:t>
+      </w:r>
+      <w:proofErr w:type="spellStart"/>
+      <w:r>
+        <w:t>CarDamageVisualController</w:t>
+      </w:r>
+      <w:proofErr w:type="spellEnd"/>
+      <w:r>
+        <w:t>). Механизм (</w:t>
+      </w:r>
+      <w:proofErr w:type="spellStart"/>
+      <w:r>
+        <w:t>InjectGameObject</w:t>
+      </w:r>
+      <w:proofErr w:type="spellEnd"/>
+      <w:r>
+        <w:t xml:space="preserve">) — ровно тот, что будет дёргать </w:t>
+      </w:r>
+      <w:proofErr w:type="spellStart"/>
+      <w:r>
+        <w:t>CarFactory</w:t>
+      </w:r>
+      <w:proofErr w:type="spellEnd"/>
+      <w:r>
+        <w:t xml:space="preserve"> на шаге 5 → не </w:t>
+      </w:r>
+      <w:proofErr w:type="spellStart"/>
+      <w:r>
+        <w:t>throwaway</w:t>
+      </w:r>
+      <w:proofErr w:type="spellEnd"/>
+      <w:r>
+        <w:t>.</w:t>
+      </w:r>
+    </w:p>
+    <w:p>
+      <w:r>
+        <w:t xml:space="preserve">2. Уникальный </w:t>
+      </w:r>
+      <w:proofErr w:type="spellStart"/>
+      <w:r>
+        <w:t>CarId</w:t>
+      </w:r>
+      <w:proofErr w:type="spellEnd"/>
+      <w:r>
+        <w:t>. Игрок _</w:t>
+      </w:r>
+      <w:proofErr w:type="spellStart"/>
+      <w:r>
+        <w:t>carId</w:t>
+      </w:r>
+      <w:proofErr w:type="spellEnd"/>
+      <w:r>
+        <w:t xml:space="preserve"> = 0, враг _</w:t>
+      </w:r>
+      <w:proofErr w:type="spellStart"/>
+      <w:r>
+        <w:t>carId</w:t>
+      </w:r>
+      <w:proofErr w:type="spellEnd"/>
+      <w:r>
+        <w:t xml:space="preserve"> = 1 (выставит </w:t>
+      </w:r>
+      <w:proofErr w:type="spellStart"/>
+      <w:r>
+        <w:t>editor</w:t>
+      </w:r>
+      <w:proofErr w:type="spellEnd"/>
+      <w:r>
+        <w:t>-скрипт).</w:t>
+      </w:r>
+    </w:p>
+    <w:p>
+      <w:r>
+        <w:t xml:space="preserve">3. Источник ввода на каждую машину (ключевая абстракция). Новый </w:t>
+      </w:r>
+      <w:proofErr w:type="spellStart"/>
+      <w:proofErr w:type="gramStart"/>
+      <w:r>
+        <w:t>AiInputProvider</w:t>
+      </w:r>
+      <w:proofErr w:type="spellEnd"/>
+      <w:r>
+        <w:t xml:space="preserve"> :</w:t>
+      </w:r>
+      <w:proofErr w:type="gramEnd"/>
+      <w:r>
+        <w:t xml:space="preserve"> </w:t>
+      </w:r>
+      <w:proofErr w:type="spellStart"/>
+      <w:r>
+        <w:t>IInputProvider</w:t>
+      </w:r>
+      <w:proofErr w:type="spellEnd"/>
+      <w:r>
+        <w:t xml:space="preserve"> (</w:t>
+      </w:r>
+      <w:proofErr w:type="spellStart"/>
+      <w:r>
+        <w:t>plain</w:t>
+      </w:r>
+      <w:proofErr w:type="spellEnd"/>
+      <w:r>
+        <w:t xml:space="preserve"> C#, по экземпляру на врага) — настраиваемые </w:t>
+      </w:r>
+      <w:proofErr w:type="spellStart"/>
+      <w:r>
+        <w:t>Move</w:t>
+      </w:r>
+      <w:proofErr w:type="spellEnd"/>
+      <w:r>
+        <w:t>/</w:t>
+      </w:r>
+      <w:proofErr w:type="spellStart"/>
+      <w:r>
+        <w:t>Handbrake</w:t>
+      </w:r>
+      <w:proofErr w:type="spellEnd"/>
+      <w:r>
+        <w:t xml:space="preserve">/Nitro. </w:t>
+      </w:r>
+      <w:proofErr w:type="spellStart"/>
+      <w:r>
+        <w:t>CarController</w:t>
+      </w:r>
+      <w:proofErr w:type="spellEnd"/>
+      <w:r>
+        <w:t xml:space="preserve"> получает </w:t>
+      </w:r>
+      <w:proofErr w:type="spellStart"/>
+      <w:proofErr w:type="gramStart"/>
+      <w:r>
+        <w:t>SetInputSource</w:t>
+      </w:r>
+      <w:proofErr w:type="spellEnd"/>
+      <w:r>
+        <w:t>(</w:t>
+      </w:r>
+      <w:proofErr w:type="spellStart"/>
+      <w:proofErr w:type="gramEnd"/>
+      <w:r>
+        <w:t>IInputProvider</w:t>
+      </w:r>
+      <w:proofErr w:type="spellEnd"/>
+      <w:r>
+        <w:t xml:space="preserve">): игрок остаётся на </w:t>
+      </w:r>
+      <w:proofErr w:type="spellStart"/>
+      <w:r>
+        <w:t>keyboard-синглтоне</w:t>
+      </w:r>
+      <w:proofErr w:type="spellEnd"/>
+      <w:r>
+        <w:t xml:space="preserve"> из </w:t>
+      </w:r>
+      <w:proofErr w:type="spellStart"/>
+      <w:r>
+        <w:t>Construct</w:t>
+      </w:r>
+      <w:proofErr w:type="spellEnd"/>
+      <w:r>
+        <w:t>, врага перекрывает обёртка.</w:t>
+      </w:r>
+    </w:p>
+    <w:p/>
+    <w:p>
+      <w:pPr>
+        <w:rPr>
+          <w:lang w:val="en-US"/>
+        </w:rPr>
+      </w:pPr>
+      <w:r>
+        <w:t>Новые</w:t>
+      </w:r>
+      <w:r>
+        <w:rPr>
+          <w:lang w:val="en-US"/>
+        </w:rPr>
+        <w:t xml:space="preserve"> </w:t>
+      </w:r>
+      <w:r>
+        <w:t>файлы</w:t>
+      </w:r>
+    </w:p>
+    <w:p>
+      <w:pPr>
+        <w:rPr>
+          <w:lang w:val="en-US"/>
+        </w:rPr>
+      </w:pPr>
+    </w:p>
+    <w:p>
+      <w:pPr>
+        <w:rPr>
+          <w:lang w:val="en-US"/>
+        </w:rPr>
+      </w:pPr>
+      <w:r>
+        <w:rPr>
+          <w:lang w:val="en-US"/>
+        </w:rPr>
+        <w:t>- Models/</w:t>
+      </w:r>
+      <w:proofErr w:type="spellStart"/>
+      <w:r>
+        <w:rPr>
+          <w:lang w:val="en-US"/>
+        </w:rPr>
+        <w:t>AiState.cs</w:t>
+      </w:r>
+      <w:proofErr w:type="spellEnd"/>
+      <w:r>
+        <w:rPr>
+          <w:lang w:val="en-US"/>
+        </w:rPr>
+        <w:t xml:space="preserve"> — </w:t>
+      </w:r>
+      <w:proofErr w:type="spellStart"/>
+      <w:r>
+        <w:rPr>
+          <w:lang w:val="en-US"/>
+        </w:rPr>
+        <w:t>enum</w:t>
+      </w:r>
+      <w:proofErr w:type="spellEnd"/>
+      <w:r>
+        <w:rPr>
+          <w:lang w:val="en-US"/>
+        </w:rPr>
+        <w:t xml:space="preserve"> Idle, Pursue, Ram, Recover.</w:t>
+      </w:r>
+    </w:p>
+    <w:p>
+      <w:pPr>
+        <w:rPr>
+          <w:lang w:val="en-US"/>
+        </w:rPr>
+      </w:pPr>
+      <w:r>
+        <w:rPr>
+          <w:lang w:val="en-US"/>
+        </w:rPr>
+        <w:t>- Core/Input/</w:t>
+      </w:r>
+      <w:proofErr w:type="spellStart"/>
+      <w:r>
+        <w:rPr>
+          <w:lang w:val="en-US"/>
+        </w:rPr>
+        <w:t>AiInputProvider.cs</w:t>
+      </w:r>
+      <w:proofErr w:type="spellEnd"/>
+      <w:r>
+        <w:rPr>
+          <w:lang w:val="en-US"/>
+        </w:rPr>
+        <w:t xml:space="preserve"> — </w:t>
+      </w:r>
+      <w:r>
+        <w:t>настраиваемый</w:t>
+      </w:r>
+      <w:r>
+        <w:rPr>
+          <w:lang w:val="en-US"/>
+        </w:rPr>
+        <w:t xml:space="preserve"> </w:t>
+      </w:r>
+      <w:proofErr w:type="spellStart"/>
+      <w:r>
+        <w:rPr>
+          <w:lang w:val="en-US"/>
+        </w:rPr>
+        <w:t>IInputProvider</w:t>
+      </w:r>
+      <w:proofErr w:type="spellEnd"/>
+      <w:r>
+        <w:rPr>
+          <w:lang w:val="en-US"/>
+        </w:rPr>
+        <w:t>.</w:t>
+      </w:r>
+    </w:p>
+    <w:p>
+      <w:pPr>
+        <w:rPr>
+          <w:lang w:val="en-US"/>
+        </w:rPr>
+      </w:pPr>
+      <w:r>
+        <w:rPr>
+          <w:lang w:val="en-US"/>
+        </w:rPr>
+        <w:t>- Data/Configs/Enemies/</w:t>
+      </w:r>
+      <w:proofErr w:type="spellStart"/>
+      <w:r>
+        <w:rPr>
+          <w:lang w:val="en-US"/>
+        </w:rPr>
+        <w:t>EnemyPersonalityConfig.cs</w:t>
+      </w:r>
+      <w:proofErr w:type="spellEnd"/>
+      <w:r>
+        <w:rPr>
+          <w:lang w:val="en-US"/>
+        </w:rPr>
+        <w:t xml:space="preserve"> — SO: </w:t>
+      </w:r>
+      <w:proofErr w:type="spellStart"/>
+      <w:proofErr w:type="gramStart"/>
+      <w:r>
+        <w:rPr>
+          <w:lang w:val="en-US"/>
+        </w:rPr>
+        <w:t>RamAggression</w:t>
+      </w:r>
+      <w:proofErr w:type="spellEnd"/>
+      <w:r>
+        <w:rPr>
+          <w:lang w:val="en-US"/>
+        </w:rPr>
+        <w:t>(0..</w:t>
+      </w:r>
+      <w:proofErr w:type="gramEnd"/>
+      <w:r>
+        <w:rPr>
+          <w:lang w:val="en-US"/>
+        </w:rPr>
+        <w:t xml:space="preserve">1), </w:t>
+      </w:r>
+      <w:proofErr w:type="spellStart"/>
+      <w:r>
+        <w:rPr>
+          <w:lang w:val="en-US"/>
+        </w:rPr>
+        <w:t>RetreatHpThreshold</w:t>
+      </w:r>
+      <w:proofErr w:type="spellEnd"/>
+      <w:r>
+        <w:rPr>
+          <w:lang w:val="en-US"/>
+        </w:rPr>
+        <w:t xml:space="preserve">, </w:t>
+      </w:r>
+      <w:proofErr w:type="spellStart"/>
+      <w:r>
+        <w:rPr>
+          <w:lang w:val="en-US"/>
+        </w:rPr>
+        <w:t>PickupPriority</w:t>
+      </w:r>
+      <w:proofErr w:type="spellEnd"/>
+      <w:r>
+        <w:rPr>
+          <w:lang w:val="en-US"/>
+        </w:rPr>
+        <w:t xml:space="preserve">, </w:t>
+      </w:r>
+      <w:proofErr w:type="spellStart"/>
+      <w:r>
+        <w:rPr>
+          <w:lang w:val="en-US"/>
+        </w:rPr>
+        <w:t>TargetSwitchCooldown</w:t>
+      </w:r>
+      <w:proofErr w:type="spellEnd"/>
+      <w:r>
+        <w:rPr>
+          <w:lang w:val="en-US"/>
+        </w:rPr>
+        <w:t xml:space="preserve"> + </w:t>
+      </w:r>
+      <w:r>
+        <w:t>тюнинг</w:t>
+      </w:r>
+      <w:r>
+        <w:rPr>
+          <w:lang w:val="en-US"/>
+        </w:rPr>
+        <w:t xml:space="preserve"> (</w:t>
+      </w:r>
+      <w:r>
+        <w:t>дистанции</w:t>
+      </w:r>
+      <w:r>
+        <w:rPr>
+          <w:lang w:val="en-US"/>
+        </w:rPr>
+        <w:t xml:space="preserve"> Pursue/Ram, </w:t>
+      </w:r>
+      <w:r>
+        <w:t>длительность</w:t>
+      </w:r>
+      <w:r>
+        <w:rPr>
+          <w:lang w:val="en-US"/>
+        </w:rPr>
+        <w:t xml:space="preserve"> Recover, </w:t>
+      </w:r>
+      <w:r>
+        <w:t>нитро</w:t>
+      </w:r>
+      <w:r>
+        <w:rPr>
+          <w:lang w:val="en-US"/>
+        </w:rPr>
+        <w:t xml:space="preserve"> </w:t>
+      </w:r>
+      <w:r>
+        <w:t>на</w:t>
+      </w:r>
+      <w:r>
+        <w:rPr>
+          <w:lang w:val="en-US"/>
+        </w:rPr>
+        <w:t xml:space="preserve"> </w:t>
+      </w:r>
+      <w:r>
+        <w:t>рывке</w:t>
+      </w:r>
+      <w:r>
+        <w:rPr>
+          <w:lang w:val="en-US"/>
+        </w:rPr>
+        <w:t xml:space="preserve">). </w:t>
+      </w:r>
+      <w:r>
+        <w:t>Дефолтный</w:t>
+      </w:r>
+      <w:r>
+        <w:rPr>
+          <w:lang w:val="en-US"/>
+        </w:rPr>
+        <w:t xml:space="preserve"> </w:t>
+      </w:r>
+      <w:r>
+        <w:t>профиль</w:t>
+      </w:r>
+      <w:r>
+        <w:rPr>
+          <w:lang w:val="en-US"/>
+        </w:rPr>
+        <w:t xml:space="preserve"> </w:t>
+      </w:r>
+      <w:r>
+        <w:t>шага</w:t>
+      </w:r>
+      <w:r>
+        <w:rPr>
+          <w:lang w:val="en-US"/>
+        </w:rPr>
+        <w:t xml:space="preserve"> 4 — Aggressor.</w:t>
+      </w:r>
+    </w:p>
+    <w:p>
+      <w:r>
+        <w:rPr>
+          <w:lang w:val="en-US"/>
+        </w:rPr>
+        <w:t>- Services/AI/</w:t>
+      </w:r>
+      <w:proofErr w:type="spellStart"/>
+      <w:r>
+        <w:rPr>
+          <w:lang w:val="en-US"/>
+        </w:rPr>
+        <w:t>IEnemyAIService.cs</w:t>
+      </w:r>
+      <w:proofErr w:type="spellEnd"/>
+      <w:r>
+        <w:rPr>
+          <w:lang w:val="en-US"/>
+        </w:rPr>
+        <w:t xml:space="preserve"> + </w:t>
+      </w:r>
+      <w:proofErr w:type="spellStart"/>
+      <w:r>
+        <w:rPr>
+          <w:lang w:val="en-US"/>
+        </w:rPr>
+        <w:t>EnemyAIService.cs</w:t>
+      </w:r>
+      <w:proofErr w:type="spellEnd"/>
+      <w:r>
+        <w:rPr>
+          <w:lang w:val="en-US"/>
+        </w:rPr>
+        <w:t xml:space="preserve"> — pure C#, stateless </w:t>
+      </w:r>
+      <w:proofErr w:type="spellStart"/>
+      <w:r>
+        <w:t>синглтон</w:t>
+      </w:r>
+      <w:proofErr w:type="spellEnd"/>
+      <w:r>
+        <w:rPr>
+          <w:lang w:val="en-US"/>
+        </w:rPr>
+        <w:t xml:space="preserve">: </w:t>
+      </w:r>
+      <w:proofErr w:type="spellStart"/>
+      <w:r>
+        <w:rPr>
+          <w:lang w:val="en-US"/>
+        </w:rPr>
+        <w:t>AiDecision</w:t>
+      </w:r>
+      <w:proofErr w:type="spellEnd"/>
+      <w:r>
+        <w:rPr>
+          <w:lang w:val="en-US"/>
+        </w:rPr>
+        <w:t xml:space="preserve"> </w:t>
+      </w:r>
+      <w:proofErr w:type="gramStart"/>
+      <w:r>
+        <w:rPr>
+          <w:lang w:val="en-US"/>
+        </w:rPr>
+        <w:t>Tick(</w:t>
+      </w:r>
+      <w:proofErr w:type="gramEnd"/>
+      <w:r>
+        <w:rPr>
+          <w:lang w:val="en-US"/>
+        </w:rPr>
+        <w:t xml:space="preserve">ref </w:t>
+      </w:r>
+      <w:proofErr w:type="spellStart"/>
+      <w:r>
+        <w:rPr>
+          <w:lang w:val="en-US"/>
+        </w:rPr>
+        <w:t>AiBrainState</w:t>
+      </w:r>
+      <w:proofErr w:type="spellEnd"/>
+      <w:r>
+        <w:rPr>
+          <w:lang w:val="en-US"/>
+        </w:rPr>
+        <w:t xml:space="preserve"> brain, in </w:t>
+      </w:r>
+      <w:proofErr w:type="spellStart"/>
+      <w:r>
+        <w:rPr>
+          <w:lang w:val="en-US"/>
+        </w:rPr>
+        <w:t>AiPerception</w:t>
+      </w:r>
+      <w:proofErr w:type="spellEnd"/>
+      <w:r>
+        <w:rPr>
+          <w:lang w:val="en-US"/>
+        </w:rPr>
+        <w:t xml:space="preserve"> p, </w:t>
+      </w:r>
+      <w:proofErr w:type="spellStart"/>
+      <w:r>
+        <w:rPr>
+          <w:lang w:val="en-US"/>
+        </w:rPr>
+        <w:t>EnemyPersonalityConfig</w:t>
+      </w:r>
+      <w:proofErr w:type="spellEnd"/>
+      <w:r>
+        <w:rPr>
+          <w:lang w:val="en-US"/>
+        </w:rPr>
+        <w:t xml:space="preserve"> profile, float dt). </w:t>
+      </w:r>
+      <w:r>
+        <w:t>Внутренний</w:t>
+      </w:r>
+      <w:r>
+        <w:rPr>
+          <w:lang w:val="en-US"/>
+        </w:rPr>
+        <w:t xml:space="preserve"> FSM </w:t>
+      </w:r>
+      <w:proofErr w:type="spellStart"/>
+      <w:r>
+        <w:rPr>
+          <w:lang w:val="en-US"/>
+        </w:rPr>
+        <w:t>Idle→Pursue→Ram→Recover</w:t>
+      </w:r>
+      <w:proofErr w:type="spellEnd"/>
+      <w:r>
+        <w:rPr>
+          <w:lang w:val="en-US"/>
+        </w:rPr>
+        <w:t xml:space="preserve"> (</w:t>
+      </w:r>
+      <w:r>
+        <w:t>лёгкий</w:t>
+      </w:r>
+      <w:r>
+        <w:rPr>
+          <w:lang w:val="en-US"/>
+        </w:rPr>
+        <w:t xml:space="preserve"> </w:t>
+      </w:r>
+      <w:proofErr w:type="spellStart"/>
+      <w:r>
+        <w:rPr>
+          <w:lang w:val="en-US"/>
+        </w:rPr>
+        <w:t>enum</w:t>
+      </w:r>
+      <w:proofErr w:type="spellEnd"/>
+      <w:r>
+        <w:rPr>
+          <w:lang w:val="en-US"/>
+        </w:rPr>
+        <w:t xml:space="preserve">-switch </w:t>
+      </w:r>
+      <w:r>
+        <w:t>внутри</w:t>
+      </w:r>
+      <w:r>
+        <w:rPr>
+          <w:lang w:val="en-US"/>
+        </w:rPr>
+        <w:t xml:space="preserve"> </w:t>
+      </w:r>
+      <w:r>
+        <w:t>сервиса</w:t>
+      </w:r>
+      <w:r>
+        <w:rPr>
+          <w:lang w:val="en-US"/>
+        </w:rPr>
+        <w:t xml:space="preserve"> — </w:t>
+      </w:r>
+      <w:r>
+        <w:t>генерик</w:t>
+      </w:r>
+      <w:r>
+        <w:rPr>
+          <w:lang w:val="en-US"/>
+        </w:rPr>
+        <w:t xml:space="preserve"> </w:t>
+      </w:r>
+      <w:proofErr w:type="spellStart"/>
+      <w:proofErr w:type="gramStart"/>
+      <w:r>
+        <w:rPr>
+          <w:lang w:val="en-US"/>
+        </w:rPr>
+        <w:t>StateMachine</w:t>
+      </w:r>
+      <w:proofErr w:type="spellEnd"/>
+      <w:r>
+        <w:rPr>
+          <w:lang w:val="en-US"/>
+        </w:rPr>
+        <w:t>&lt;</w:t>
+      </w:r>
+      <w:proofErr w:type="gramEnd"/>
+      <w:r>
+        <w:rPr>
+          <w:lang w:val="en-US"/>
+        </w:rPr>
+        <w:t xml:space="preserve">TEnum&gt; </w:t>
+      </w:r>
+      <w:r>
+        <w:t>тут</w:t>
+      </w:r>
+      <w:r>
+        <w:rPr>
+          <w:lang w:val="en-US"/>
+        </w:rPr>
+        <w:t xml:space="preserve"> </w:t>
+      </w:r>
+      <w:r>
+        <w:t>не</w:t>
+      </w:r>
+      <w:r>
+        <w:rPr>
+          <w:lang w:val="en-US"/>
+        </w:rPr>
+        <w:t xml:space="preserve"> </w:t>
+      </w:r>
+      <w:r>
+        <w:t>подходит</w:t>
+      </w:r>
+      <w:r>
+        <w:rPr>
+          <w:lang w:val="en-US"/>
+        </w:rPr>
+        <w:t xml:space="preserve">: </w:t>
+      </w:r>
+      <w:r>
+        <w:t>он</w:t>
+      </w:r>
+      <w:r>
+        <w:rPr>
+          <w:lang w:val="en-US"/>
+        </w:rPr>
+        <w:t xml:space="preserve"> void-Tick </w:t>
+      </w:r>
+      <w:r>
+        <w:t>и</w:t>
+      </w:r>
+      <w:r>
+        <w:rPr>
+          <w:lang w:val="en-US"/>
+        </w:rPr>
+        <w:t xml:space="preserve"> </w:t>
+      </w:r>
+      <w:r>
+        <w:t>заточен</w:t>
+      </w:r>
+      <w:r>
+        <w:rPr>
+          <w:lang w:val="en-US"/>
+        </w:rPr>
+        <w:t xml:space="preserve"> </w:t>
+      </w:r>
+      <w:r>
+        <w:t>под</w:t>
+      </w:r>
+      <w:r>
+        <w:rPr>
+          <w:lang w:val="en-US"/>
+        </w:rPr>
+        <w:t xml:space="preserve"> </w:t>
+      </w:r>
+      <w:proofErr w:type="spellStart"/>
+      <w:r>
+        <w:rPr>
+          <w:lang w:val="en-US"/>
+        </w:rPr>
+        <w:t>GameState</w:t>
+      </w:r>
+      <w:proofErr w:type="spellEnd"/>
+      <w:r>
+        <w:rPr>
+          <w:lang w:val="en-US"/>
+        </w:rPr>
+        <w:t xml:space="preserve">). </w:t>
+      </w:r>
+      <w:r>
+        <w:t xml:space="preserve">Состояние врага (текущий стейт, таймеры) живёт в </w:t>
+      </w:r>
+      <w:proofErr w:type="spellStart"/>
+      <w:r>
+        <w:t>AiBrainState</w:t>
+      </w:r>
+      <w:proofErr w:type="spellEnd"/>
+      <w:r>
+        <w:t xml:space="preserve">, который держит контроллер → один </w:t>
+      </w:r>
+      <w:proofErr w:type="spellStart"/>
+      <w:r>
+        <w:t>синглтон</w:t>
+      </w:r>
+      <w:proofErr w:type="spellEnd"/>
+      <w:r>
+        <w:t xml:space="preserve"> обслуживает N врагов на шаге 5. Цель — игрок (один </w:t>
+      </w:r>
+      <w:proofErr w:type="spellStart"/>
+      <w:r>
+        <w:t>таргет</w:t>
+      </w:r>
+      <w:proofErr w:type="spellEnd"/>
+      <w:r>
+        <w:t xml:space="preserve">; </w:t>
+      </w:r>
+      <w:proofErr w:type="spellStart"/>
+      <w:r>
+        <w:t>TargetSelectionService</w:t>
+      </w:r>
+      <w:proofErr w:type="spellEnd"/>
+      <w:r>
+        <w:t xml:space="preserve"> — это шаг 5, когда машин 3–6).</w:t>
+      </w:r>
+    </w:p>
+    <w:p>
+      <w:r>
+        <w:t xml:space="preserve">- </w:t>
+      </w:r>
+      <w:proofErr w:type="spellStart"/>
+      <w:r>
+        <w:t>Controllers</w:t>
+      </w:r>
+      <w:proofErr w:type="spellEnd"/>
+      <w:r>
+        <w:t>/</w:t>
+      </w:r>
+      <w:proofErr w:type="spellStart"/>
+      <w:r>
+        <w:t>Enemies</w:t>
+      </w:r>
+      <w:proofErr w:type="spellEnd"/>
+      <w:r>
+        <w:t>/</w:t>
+      </w:r>
+      <w:proofErr w:type="spellStart"/>
+      <w:r>
+        <w:t>EnemyCarController.cs</w:t>
+      </w:r>
+      <w:proofErr w:type="spellEnd"/>
+      <w:r>
+        <w:t xml:space="preserve"> — </w:t>
+      </w:r>
+      <w:proofErr w:type="spellStart"/>
+      <w:r>
+        <w:t>MonoBehaviour</w:t>
+      </w:r>
+      <w:proofErr w:type="spellEnd"/>
+      <w:r>
+        <w:t>: [</w:t>
+      </w:r>
+      <w:proofErr w:type="spellStart"/>
+      <w:r>
+        <w:t>Inject</w:t>
+      </w:r>
+      <w:proofErr w:type="spellEnd"/>
+      <w:r>
+        <w:t xml:space="preserve">] </w:t>
+      </w:r>
+      <w:proofErr w:type="spellStart"/>
+      <w:proofErr w:type="gramStart"/>
+      <w:r>
+        <w:t>Construct</w:t>
+      </w:r>
+      <w:proofErr w:type="spellEnd"/>
+      <w:r>
+        <w:t>(</w:t>
+      </w:r>
+      <w:proofErr w:type="spellStart"/>
+      <w:proofErr w:type="gramEnd"/>
+      <w:r>
+        <w:t>IEnemyAIService</w:t>
+      </w:r>
+      <w:proofErr w:type="spellEnd"/>
+      <w:r>
+        <w:t xml:space="preserve"> </w:t>
+      </w:r>
+      <w:proofErr w:type="spellStart"/>
+      <w:r>
+        <w:t>ai</w:t>
+      </w:r>
+      <w:proofErr w:type="spellEnd"/>
+      <w:r>
+        <w:t xml:space="preserve">, </w:t>
+      </w:r>
+      <w:proofErr w:type="spellStart"/>
+      <w:r>
+        <w:t>IEventBus</w:t>
+      </w:r>
+      <w:proofErr w:type="spellEnd"/>
+      <w:r>
+        <w:t xml:space="preserve"> </w:t>
+      </w:r>
+      <w:proofErr w:type="spellStart"/>
+      <w:r>
+        <w:t>bus</w:t>
+      </w:r>
+      <w:proofErr w:type="spellEnd"/>
+      <w:r>
+        <w:t xml:space="preserve">); владеет </w:t>
+      </w:r>
+      <w:proofErr w:type="spellStart"/>
+      <w:r>
+        <w:t>AiInputProvider</w:t>
+      </w:r>
+      <w:proofErr w:type="spellEnd"/>
+      <w:r>
+        <w:t xml:space="preserve">, ставит его на соседний </w:t>
+      </w:r>
+      <w:proofErr w:type="spellStart"/>
+      <w:r>
+        <w:t>CarController</w:t>
+      </w:r>
+      <w:proofErr w:type="spellEnd"/>
+      <w:r>
+        <w:t xml:space="preserve"> через </w:t>
+      </w:r>
+      <w:proofErr w:type="spellStart"/>
+      <w:r>
+        <w:t>SetInputSource</w:t>
+      </w:r>
+      <w:proofErr w:type="spellEnd"/>
+      <w:r>
+        <w:t xml:space="preserve">; </w:t>
+      </w:r>
+      <w:proofErr w:type="spellStart"/>
+      <w:r>
+        <w:t>сериализованный</w:t>
+      </w:r>
+      <w:proofErr w:type="spellEnd"/>
+      <w:r>
+        <w:t xml:space="preserve"> </w:t>
+      </w:r>
+      <w:proofErr w:type="spellStart"/>
+      <w:r>
+        <w:t>таргет-CarController</w:t>
+      </w:r>
+      <w:proofErr w:type="spellEnd"/>
+      <w:r>
+        <w:t xml:space="preserve"> (игрок) + </w:t>
+      </w:r>
+      <w:proofErr w:type="spellStart"/>
+      <w:r>
+        <w:t>SetTarget</w:t>
+      </w:r>
+      <w:proofErr w:type="spellEnd"/>
+      <w:r>
+        <w:t xml:space="preserve">(...) на будущее; в </w:t>
+      </w:r>
+      <w:proofErr w:type="spellStart"/>
+      <w:r>
+        <w:t>FixedUpdate</w:t>
+      </w:r>
+      <w:proofErr w:type="spellEnd"/>
+      <w:r>
+        <w:t xml:space="preserve"> собирает </w:t>
+      </w:r>
+      <w:proofErr w:type="spellStart"/>
+      <w:r>
+        <w:t>AiPerception</w:t>
+      </w:r>
+      <w:proofErr w:type="spellEnd"/>
+      <w:r>
+        <w:t xml:space="preserve"> из трансформов + HP из </w:t>
+      </w:r>
+      <w:proofErr w:type="spellStart"/>
+      <w:r>
+        <w:t>DamageService</w:t>
+      </w:r>
+      <w:proofErr w:type="spellEnd"/>
+      <w:r>
+        <w:t xml:space="preserve"> и пишет решение в провайдер.</w:t>
+      </w:r>
+    </w:p>
+    <w:p/>
+    <w:p>
+      <w:pPr>
+        <w:rPr>
+          <w:lang w:val="en-US"/>
+        </w:rPr>
+      </w:pPr>
+      <w:r>
+        <w:t>Правки</w:t>
+      </w:r>
+    </w:p>
+    <w:p>
+      <w:pPr>
+        <w:rPr>
+          <w:lang w:val="en-US"/>
+        </w:rPr>
+      </w:pPr>
+    </w:p>
+    <w:p>
+      <w:pPr>
+        <w:rPr>
+          <w:lang w:val="en-US"/>
+        </w:rPr>
+      </w:pPr>
+      <w:r>
+        <w:rPr>
+          <w:lang w:val="en-US"/>
+        </w:rPr>
+        <w:t xml:space="preserve">- </w:t>
+      </w:r>
+      <w:proofErr w:type="spellStart"/>
+      <w:r>
+        <w:rPr>
+          <w:lang w:val="en-US"/>
+        </w:rPr>
+        <w:t>CarController.cs</w:t>
+      </w:r>
+      <w:proofErr w:type="spellEnd"/>
+      <w:r>
+        <w:rPr>
+          <w:lang w:val="en-US"/>
+        </w:rPr>
+        <w:t xml:space="preserve"> — public void </w:t>
+      </w:r>
+      <w:proofErr w:type="spellStart"/>
+      <w:proofErr w:type="gramStart"/>
+      <w:r>
+        <w:rPr>
+          <w:lang w:val="en-US"/>
+        </w:rPr>
+        <w:t>SetInputSource</w:t>
+      </w:r>
+      <w:proofErr w:type="spellEnd"/>
+      <w:r>
+        <w:rPr>
+          <w:lang w:val="en-US"/>
+        </w:rPr>
+        <w:t>(</w:t>
+      </w:r>
+      <w:proofErr w:type="spellStart"/>
+      <w:proofErr w:type="gramEnd"/>
+      <w:r>
+        <w:rPr>
+          <w:lang w:val="en-US"/>
+        </w:rPr>
+        <w:t>IInputProvider</w:t>
+      </w:r>
+      <w:proofErr w:type="spellEnd"/>
+      <w:r>
+        <w:rPr>
+          <w:lang w:val="en-US"/>
+        </w:rPr>
+        <w:t>).</w:t>
+      </w:r>
+    </w:p>
+    <w:p>
+      <w:pPr>
+        <w:rPr>
+          <w:lang w:val="en-US"/>
+        </w:rPr>
+      </w:pPr>
+      <w:r>
+        <w:rPr>
+          <w:lang w:val="en-US"/>
+        </w:rPr>
+        <w:lastRenderedPageBreak/>
+        <w:t xml:space="preserve">- </w:t>
+      </w:r>
+      <w:proofErr w:type="spellStart"/>
+      <w:r>
+        <w:rPr>
+          <w:lang w:val="en-US"/>
+        </w:rPr>
+        <w:t>GameLifetimeScope.cs</w:t>
+      </w:r>
+      <w:proofErr w:type="spellEnd"/>
+      <w:r>
+        <w:rPr>
+          <w:lang w:val="en-US"/>
+        </w:rPr>
+        <w:t xml:space="preserve"> — </w:t>
+      </w:r>
+      <w:r>
+        <w:t>регистрация</w:t>
+      </w:r>
+      <w:r>
+        <w:rPr>
+          <w:lang w:val="en-US"/>
+        </w:rPr>
+        <w:t xml:space="preserve"> </w:t>
+      </w:r>
+      <w:proofErr w:type="spellStart"/>
+      <w:r>
+        <w:rPr>
+          <w:lang w:val="en-US"/>
+        </w:rPr>
+        <w:t>EnemyAIService→IEnemyAIService</w:t>
+      </w:r>
+      <w:proofErr w:type="spellEnd"/>
+      <w:r>
+        <w:rPr>
+          <w:lang w:val="en-US"/>
+        </w:rPr>
+        <w:t xml:space="preserve">; </w:t>
+      </w:r>
+      <w:r>
+        <w:t>замена</w:t>
+      </w:r>
+      <w:r>
+        <w:rPr>
+          <w:lang w:val="en-US"/>
+        </w:rPr>
+        <w:t xml:space="preserve"> </w:t>
+      </w:r>
+      <w:r>
+        <w:t>одиночных</w:t>
+      </w:r>
+      <w:r>
+        <w:rPr>
+          <w:lang w:val="en-US"/>
+        </w:rPr>
+        <w:t xml:space="preserve"> car-</w:t>
+      </w:r>
+      <w:r>
+        <w:t>регистраций</w:t>
+      </w:r>
+      <w:r>
+        <w:rPr>
+          <w:lang w:val="en-US"/>
+        </w:rPr>
+        <w:t xml:space="preserve"> </w:t>
+      </w:r>
+      <w:r>
+        <w:t>на</w:t>
+      </w:r>
+      <w:r>
+        <w:rPr>
+          <w:lang w:val="en-US"/>
+        </w:rPr>
+        <w:t xml:space="preserve"> </w:t>
+      </w:r>
+      <w:proofErr w:type="spellStart"/>
+      <w:r>
+        <w:rPr>
+          <w:lang w:val="en-US"/>
+        </w:rPr>
+        <w:t>InjectGameObject</w:t>
+      </w:r>
+      <w:proofErr w:type="spellEnd"/>
+      <w:r>
+        <w:rPr>
+          <w:lang w:val="en-US"/>
+        </w:rPr>
+        <w:t xml:space="preserve"> </w:t>
+      </w:r>
+      <w:r>
+        <w:t>по</w:t>
+      </w:r>
+      <w:r>
+        <w:rPr>
+          <w:lang w:val="en-US"/>
+        </w:rPr>
+        <w:t xml:space="preserve"> _</w:t>
+      </w:r>
+      <w:proofErr w:type="spellStart"/>
+      <w:r>
+        <w:rPr>
+          <w:lang w:val="en-US"/>
+        </w:rPr>
+        <w:t>sceneCars</w:t>
+      </w:r>
+      <w:proofErr w:type="spellEnd"/>
+      <w:r>
+        <w:rPr>
+          <w:lang w:val="en-US"/>
+        </w:rPr>
+        <w:t>.</w:t>
+      </w:r>
+    </w:p>
+    <w:p>
+      <w:pPr>
+        <w:rPr>
+          <w:lang w:val="en-US"/>
+        </w:rPr>
+      </w:pPr>
+      <w:r>
+        <w:rPr>
+          <w:lang w:val="en-US"/>
+        </w:rPr>
+        <w:t xml:space="preserve">- </w:t>
+      </w:r>
+      <w:proofErr w:type="spellStart"/>
+      <w:r>
+        <w:rPr>
+          <w:lang w:val="en-US"/>
+        </w:rPr>
+        <w:t>IDamageService</w:t>
+      </w:r>
+      <w:proofErr w:type="spellEnd"/>
+      <w:r>
+        <w:rPr>
+          <w:lang w:val="en-US"/>
+        </w:rPr>
+        <w:t xml:space="preserve"> — </w:t>
+      </w:r>
+      <w:r>
+        <w:t>добавить</w:t>
+      </w:r>
+      <w:r>
+        <w:rPr>
+          <w:lang w:val="en-US"/>
+        </w:rPr>
+        <w:t xml:space="preserve"> </w:t>
+      </w:r>
+      <w:proofErr w:type="spellStart"/>
+      <w:r>
+        <w:t>публичн</w:t>
+      </w:r>
+      <w:proofErr w:type="spellEnd"/>
+    </w:p>
+    <w:p>
+      <w:pPr>
+        <w:rPr>
+          <w:lang w:val="en-US"/>
+        </w:rPr>
+      </w:pPr>
+    </w:p>
+    <w:p>
+      <w:pPr>
+        <w:rPr>
+          <w:lang w:val="en-US"/>
+        </w:rPr>
+      </w:pPr>
+      <w:r>
+        <w:rPr>
+          <w:lang w:val="en-US"/>
+        </w:rPr>
+        <w:t>Editor-</w:t>
+      </w:r>
+      <w:r>
+        <w:t>автоматизация</w:t>
+      </w:r>
+      <w:r>
+        <w:rPr>
+          <w:lang w:val="en-US"/>
+        </w:rPr>
+        <w:t xml:space="preserve"> (EDITOR_SCRIPT_NEEDED)</w:t>
+      </w:r>
+    </w:p>
+    <w:p>
+      <w:pPr>
+        <w:rPr>
+          <w:lang w:val="en-US"/>
+        </w:rPr>
+      </w:pPr>
+    </w:p>
+    <w:p>
+      <w:pPr>
+        <w:rPr>
+          <w:lang w:val="en-US"/>
+        </w:rPr>
+      </w:pPr>
+      <w:r>
+        <w:rPr>
+          <w:lang w:val="en-US"/>
+        </w:rPr>
+        <w:t xml:space="preserve">- </w:t>
+      </w:r>
+      <w:r>
+        <w:t>Создать</w:t>
+      </w:r>
+      <w:r>
+        <w:rPr>
+          <w:lang w:val="en-US"/>
+        </w:rPr>
+        <w:t xml:space="preserve"> </w:t>
+      </w:r>
+      <w:r>
+        <w:t>дефолтный</w:t>
+      </w:r>
+      <w:r>
+        <w:rPr>
+          <w:lang w:val="en-US"/>
+        </w:rPr>
+        <w:t xml:space="preserve"> </w:t>
+      </w:r>
+      <w:proofErr w:type="spellStart"/>
+      <w:r>
+        <w:rPr>
+          <w:lang w:val="en-US"/>
+        </w:rPr>
+        <w:t>EnemyPersonalityConfig</w:t>
+      </w:r>
+      <w:proofErr w:type="spellEnd"/>
+      <w:r>
+        <w:rPr>
+          <w:lang w:val="en-US"/>
+        </w:rPr>
+        <w:t xml:space="preserve"> (Aggressor) </w:t>
+      </w:r>
+      <w:r>
+        <w:t>в</w:t>
+      </w:r>
+      <w:r>
+        <w:rPr>
+          <w:lang w:val="en-US"/>
+        </w:rPr>
+        <w:t xml:space="preserve"> Data/Configs/Enemies/.</w:t>
+      </w:r>
+    </w:p>
+    <w:p>
+      <w:pPr>
+        <w:rPr>
+          <w:lang w:val="en-US"/>
+        </w:rPr>
+      </w:pPr>
+      <w:r>
+        <w:rPr>
+          <w:lang w:val="en-US"/>
+        </w:rPr>
+        <w:t xml:space="preserve">- </w:t>
+      </w:r>
+      <w:r>
+        <w:t>Собрать</w:t>
+      </w:r>
+      <w:r>
+        <w:rPr>
+          <w:lang w:val="en-US"/>
+        </w:rPr>
+        <w:t xml:space="preserve"> </w:t>
+      </w:r>
+      <w:r>
+        <w:t>вражескую</w:t>
+      </w:r>
+      <w:r>
+        <w:rPr>
+          <w:lang w:val="en-US"/>
+        </w:rPr>
+        <w:t xml:space="preserve"> </w:t>
+      </w:r>
+      <w:r>
+        <w:t>машину</w:t>
+      </w:r>
+      <w:r>
+        <w:rPr>
+          <w:lang w:val="en-US"/>
+        </w:rPr>
+        <w:t xml:space="preserve"> </w:t>
+      </w:r>
+      <w:r>
+        <w:t>в</w:t>
+      </w:r>
+      <w:r>
+        <w:rPr>
+          <w:lang w:val="en-US"/>
+        </w:rPr>
+        <w:t xml:space="preserve"> </w:t>
+      </w:r>
+      <w:r>
+        <w:t>тест</w:t>
+      </w:r>
+      <w:r>
+        <w:rPr>
+          <w:lang w:val="en-US"/>
+        </w:rPr>
+        <w:t>-</w:t>
+      </w:r>
+      <w:r>
+        <w:t>сцене</w:t>
+      </w:r>
+      <w:r>
+        <w:rPr>
+          <w:lang w:val="en-US"/>
+        </w:rPr>
+        <w:t xml:space="preserve">: </w:t>
+      </w:r>
+      <w:r>
+        <w:t>дубликат</w:t>
+      </w:r>
+      <w:r>
+        <w:rPr>
+          <w:lang w:val="en-US"/>
+        </w:rPr>
+        <w:t xml:space="preserve"> </w:t>
+      </w:r>
+      <w:proofErr w:type="spellStart"/>
+      <w:r>
+        <w:t>префаба</w:t>
+      </w:r>
+      <w:proofErr w:type="spellEnd"/>
+      <w:r>
+        <w:rPr>
+          <w:lang w:val="en-US"/>
+        </w:rPr>
+        <w:t xml:space="preserve"> </w:t>
+      </w:r>
+      <w:r>
+        <w:t>игрока</w:t>
+      </w:r>
+      <w:r>
+        <w:rPr>
+          <w:lang w:val="en-US"/>
+        </w:rPr>
+        <w:t xml:space="preserve"> → </w:t>
+      </w:r>
+      <w:r>
+        <w:t>добавить</w:t>
+      </w:r>
+      <w:r>
+        <w:rPr>
+          <w:lang w:val="en-US"/>
+        </w:rPr>
+        <w:t xml:space="preserve"> </w:t>
+      </w:r>
+      <w:proofErr w:type="spellStart"/>
+      <w:r>
+        <w:rPr>
+          <w:lang w:val="en-US"/>
+        </w:rPr>
+        <w:t>EnemyCarController</w:t>
+      </w:r>
+      <w:proofErr w:type="spellEnd"/>
+      <w:r>
+        <w:rPr>
+          <w:lang w:val="en-US"/>
+        </w:rPr>
+        <w:t>, _</w:t>
+      </w:r>
+      <w:proofErr w:type="spellStart"/>
+      <w:r>
+        <w:rPr>
+          <w:lang w:val="en-US"/>
+        </w:rPr>
+        <w:t>carId</w:t>
+      </w:r>
+      <w:proofErr w:type="spellEnd"/>
+      <w:r>
+        <w:rPr>
+          <w:lang w:val="en-US"/>
+        </w:rPr>
+        <w:t xml:space="preserve">=1, </w:t>
+      </w:r>
+      <w:r>
+        <w:t>профиль</w:t>
+      </w:r>
+      <w:r>
+        <w:rPr>
+          <w:lang w:val="en-US"/>
+        </w:rPr>
+        <w:t xml:space="preserve"> + </w:t>
+      </w:r>
+      <w:proofErr w:type="spellStart"/>
+      <w:r>
+        <w:t>таргет</w:t>
+      </w:r>
+      <w:proofErr w:type="spellEnd"/>
+      <w:r>
+        <w:rPr>
+          <w:lang w:val="en-US"/>
+        </w:rPr>
+        <w:t>(</w:t>
+      </w:r>
+      <w:r>
+        <w:t>игрок</w:t>
+      </w:r>
+      <w:r>
+        <w:rPr>
+          <w:lang w:val="en-US"/>
+        </w:rPr>
+        <w:t xml:space="preserve">) + </w:t>
+      </w:r>
+      <w:r>
+        <w:t>ссылка</w:t>
+      </w:r>
+      <w:r>
+        <w:rPr>
+          <w:lang w:val="en-US"/>
+        </w:rPr>
+        <w:t xml:space="preserve"> </w:t>
+      </w:r>
+      <w:r>
+        <w:t>на</w:t>
+      </w:r>
+      <w:r>
+        <w:rPr>
+          <w:lang w:val="en-US"/>
+        </w:rPr>
+        <w:t xml:space="preserve"> </w:t>
+      </w:r>
+      <w:r>
+        <w:t>соседний</w:t>
+      </w:r>
+      <w:r>
+        <w:rPr>
+          <w:lang w:val="en-US"/>
+        </w:rPr>
+        <w:t xml:space="preserve"> </w:t>
+      </w:r>
+      <w:proofErr w:type="spellStart"/>
+      <w:r>
+        <w:rPr>
+          <w:lang w:val="en-US"/>
+        </w:rPr>
+        <w:t>CarController</w:t>
+      </w:r>
+      <w:proofErr w:type="spellEnd"/>
+      <w:r>
+        <w:rPr>
+          <w:lang w:val="en-US"/>
+        </w:rPr>
+        <w:t xml:space="preserve">, </w:t>
+      </w:r>
+      <w:proofErr w:type="spellStart"/>
+      <w:r>
+        <w:t>спавн</w:t>
+      </w:r>
+      <w:proofErr w:type="spellEnd"/>
+      <w:r>
+        <w:rPr>
+          <w:lang w:val="en-US"/>
+        </w:rPr>
+        <w:t xml:space="preserve"> </w:t>
+      </w:r>
+      <w:r>
+        <w:t>со</w:t>
+      </w:r>
+      <w:r>
+        <w:rPr>
+          <w:lang w:val="en-US"/>
+        </w:rPr>
+        <w:t xml:space="preserve"> </w:t>
+      </w:r>
+      <w:r>
+        <w:t>смещением</w:t>
+      </w:r>
+      <w:r>
+        <w:rPr>
+          <w:lang w:val="en-US"/>
+        </w:rPr>
+        <w:t xml:space="preserve">, </w:t>
+      </w:r>
+      <w:r>
+        <w:t>прогнать</w:t>
+      </w:r>
+      <w:r>
+        <w:rPr>
+          <w:lang w:val="en-US"/>
+        </w:rPr>
+        <w:t xml:space="preserve"> </w:t>
+      </w:r>
+      <w:r>
+        <w:t>конверсию</w:t>
+      </w:r>
+      <w:r>
+        <w:rPr>
+          <w:lang w:val="en-US"/>
+        </w:rPr>
+        <w:t xml:space="preserve"> damage-</w:t>
+      </w:r>
+      <w:r>
+        <w:t>шейдера</w:t>
+      </w:r>
+      <w:r>
+        <w:rPr>
+          <w:lang w:val="en-US"/>
+        </w:rPr>
+        <w:t>.</w:t>
+      </w:r>
+    </w:p>
+    <w:p>
+      <w:pPr>
+        <w:rPr>
+          <w:lang w:val="en-US"/>
+        </w:rPr>
+      </w:pPr>
+      <w:r>
+        <w:rPr>
+          <w:lang w:val="en-US"/>
+        </w:rPr>
+        <w:t xml:space="preserve">- </w:t>
+      </w:r>
+      <w:r>
+        <w:t>Обновить</w:t>
+      </w:r>
+      <w:r>
+        <w:rPr>
+          <w:lang w:val="en-US"/>
+        </w:rPr>
+        <w:t xml:space="preserve"> Fill </w:t>
+      </w:r>
+      <w:proofErr w:type="spellStart"/>
+      <w:r>
+        <w:rPr>
+          <w:lang w:val="en-US"/>
+        </w:rPr>
+        <w:t>GameLifetimeScope</w:t>
+      </w:r>
+      <w:proofErr w:type="spellEnd"/>
+      <w:r>
+        <w:rPr>
+          <w:lang w:val="en-US"/>
+        </w:rPr>
+        <w:t xml:space="preserve"> Refs, </w:t>
+      </w:r>
+      <w:r>
+        <w:t>чтобы</w:t>
+      </w:r>
+      <w:r>
+        <w:rPr>
+          <w:lang w:val="en-US"/>
+        </w:rPr>
+        <w:t xml:space="preserve"> </w:t>
+      </w:r>
+      <w:r>
+        <w:t>заполнял</w:t>
+      </w:r>
+      <w:r>
+        <w:rPr>
+          <w:lang w:val="en-US"/>
+        </w:rPr>
+        <w:t xml:space="preserve"> _</w:t>
+      </w:r>
+      <w:proofErr w:type="spellStart"/>
+      <w:r>
+        <w:rPr>
+          <w:lang w:val="en-US"/>
+        </w:rPr>
+        <w:t>sceneCars</w:t>
+      </w:r>
+      <w:proofErr w:type="spellEnd"/>
+      <w:r>
+        <w:rPr>
+          <w:lang w:val="en-US"/>
+        </w:rPr>
+        <w:t xml:space="preserve"> </w:t>
+      </w:r>
+      <w:r>
+        <w:t>обеими</w:t>
+      </w:r>
+      <w:r>
+        <w:rPr>
+          <w:lang w:val="en-US"/>
+        </w:rPr>
+        <w:t xml:space="preserve"> </w:t>
+      </w:r>
+      <w:r>
+        <w:t>машинами</w:t>
+      </w:r>
+      <w:r>
+        <w:rPr>
+          <w:lang w:val="en-US"/>
+        </w:rPr>
         <w:t>.</w:t>
       </w:r>
     </w:p>

</xml_diff>

<commit_message>
Step 6. Eject driver
</commit_message>
<xml_diff>
--- a/docs/архитектура с первого шага.docx
+++ b/docs/архитектура с первого шага.docx
@@ -18200,6 +18200,2552 @@
     </w:p>
     <w:p>
       <w:pPr>
+        <w:pStyle w:val="3"/>
+        <w:rPr>
+          <w:lang w:val="en-US"/>
+        </w:rPr>
+      </w:pPr>
+      <w:proofErr w:type="spellStart"/>
+      <w:r>
+        <w:rPr>
+          <w:lang w:val="en-US"/>
+        </w:rPr>
+        <w:t>Правки</w:t>
+      </w:r>
+      <w:proofErr w:type="spellEnd"/>
+      <w:r>
+        <w:rPr>
+          <w:lang w:val="en-US"/>
+        </w:rPr>
+        <w:t xml:space="preserve"> </w:t>
+      </w:r>
+      <w:proofErr w:type="spellStart"/>
+      <w:r>
+        <w:rPr>
+          <w:lang w:val="en-US"/>
+        </w:rPr>
+        <w:t>плана</w:t>
+      </w:r>
+      <w:proofErr w:type="spellEnd"/>
+      <w:r>
+        <w:rPr>
+          <w:lang w:val="en-US"/>
+        </w:rPr>
+        <w:t xml:space="preserve"> </w:t>
+      </w:r>
+      <w:proofErr w:type="spellStart"/>
+      <w:r>
+        <w:rPr>
+          <w:lang w:val="en-US"/>
+        </w:rPr>
+        <w:t>шага</w:t>
+      </w:r>
+      <w:proofErr w:type="spellEnd"/>
+      <w:r>
+        <w:rPr>
+          <w:lang w:val="en-US"/>
+        </w:rPr>
+        <w:t xml:space="preserve"> 6</w:t>
+      </w:r>
+    </w:p>
+    <w:p>
+      <w:pPr>
+        <w:rPr>
+          <w:lang w:val="en-US"/>
+        </w:rPr>
+      </w:pPr>
+      <w:r>
+        <w:rPr>
+          <w:lang w:val="en-US"/>
+        </w:rPr>
+        <w:t xml:space="preserve">1. </w:t>
+      </w:r>
+      <w:proofErr w:type="spellStart"/>
+      <w:r>
+        <w:rPr>
+          <w:lang w:val="en-US"/>
+        </w:rPr>
+        <w:t>Конфиг</w:t>
+      </w:r>
+      <w:proofErr w:type="spellEnd"/>
+      <w:r>
+        <w:rPr>
+          <w:lang w:val="en-US"/>
+        </w:rPr>
+        <w:t xml:space="preserve"> — </w:t>
+      </w:r>
+      <w:proofErr w:type="spellStart"/>
+      <w:r>
+        <w:rPr>
+          <w:lang w:val="en-US"/>
+        </w:rPr>
+        <w:t>по</w:t>
+      </w:r>
+      <w:proofErr w:type="spellEnd"/>
+      <w:r>
+        <w:rPr>
+          <w:lang w:val="en-US"/>
+        </w:rPr>
+        <w:t xml:space="preserve"> SRP </w:t>
+      </w:r>
+      <w:proofErr w:type="spellStart"/>
+      <w:r>
+        <w:rPr>
+          <w:lang w:val="en-US"/>
+        </w:rPr>
+        <w:t>делаем</w:t>
+      </w:r>
+      <w:proofErr w:type="spellEnd"/>
+      <w:r>
+        <w:rPr>
+          <w:lang w:val="en-US"/>
+        </w:rPr>
+        <w:t xml:space="preserve"> </w:t>
+      </w:r>
+      <w:proofErr w:type="spellStart"/>
+      <w:r>
+        <w:rPr>
+          <w:lang w:val="en-US"/>
+        </w:rPr>
+        <w:t>отдельный</w:t>
+      </w:r>
+      <w:proofErr w:type="spellEnd"/>
+      <w:r>
+        <w:rPr>
+          <w:lang w:val="en-US"/>
+        </w:rPr>
+        <w:t xml:space="preserve"> </w:t>
+      </w:r>
+      <w:proofErr w:type="spellStart"/>
+      <w:r>
+        <w:rPr>
+          <w:lang w:val="en-US"/>
+        </w:rPr>
+        <w:t>маленький</w:t>
+      </w:r>
+      <w:proofErr w:type="spellEnd"/>
+      <w:r>
+        <w:rPr>
+          <w:lang w:val="en-US"/>
+        </w:rPr>
+        <w:t xml:space="preserve"> Data/Configs/Driver/</w:t>
+      </w:r>
+      <w:proofErr w:type="spellStart"/>
+      <w:r>
+        <w:rPr>
+          <w:lang w:val="en-US"/>
+        </w:rPr>
+        <w:t>DriverEjectConfig.cs</w:t>
+      </w:r>
+      <w:proofErr w:type="spellEnd"/>
+      <w:r>
+        <w:rPr>
+          <w:lang w:val="en-US"/>
+        </w:rPr>
+        <w:t xml:space="preserve"> (forward/up-</w:t>
+      </w:r>
+      <w:proofErr w:type="spellStart"/>
+      <w:r>
+        <w:rPr>
+          <w:lang w:val="en-US"/>
+        </w:rPr>
+        <w:t>импульс</w:t>
+      </w:r>
+      <w:proofErr w:type="spellEnd"/>
+      <w:r>
+        <w:rPr>
+          <w:lang w:val="en-US"/>
+        </w:rPr>
+        <w:t xml:space="preserve">, </w:t>
+      </w:r>
+      <w:proofErr w:type="spellStart"/>
+      <w:r>
+        <w:rPr>
+          <w:lang w:val="en-US"/>
+        </w:rPr>
+        <w:t>время</w:t>
+      </w:r>
+      <w:proofErr w:type="spellEnd"/>
+      <w:r>
+        <w:rPr>
+          <w:lang w:val="en-US"/>
+        </w:rPr>
+        <w:t xml:space="preserve"> </w:t>
+      </w:r>
+      <w:proofErr w:type="spellStart"/>
+      <w:r>
+        <w:rPr>
+          <w:lang w:val="en-US"/>
+        </w:rPr>
+        <w:t>жизни</w:t>
+      </w:r>
+      <w:proofErr w:type="spellEnd"/>
+      <w:r>
+        <w:rPr>
+          <w:lang w:val="en-US"/>
+        </w:rPr>
+        <w:t xml:space="preserve"> ragdoll-</w:t>
+      </w:r>
+      <w:proofErr w:type="spellStart"/>
+      <w:r>
+        <w:rPr>
+          <w:lang w:val="en-US"/>
+        </w:rPr>
+        <w:t>камер</w:t>
+      </w:r>
+      <w:proofErr w:type="spellEnd"/>
+      <w:r>
+        <w:rPr>
+          <w:lang w:val="en-US"/>
+        </w:rPr>
+        <w:t>-</w:t>
+      </w:r>
+      <w:proofErr w:type="spellStart"/>
+      <w:r>
+        <w:rPr>
+          <w:lang w:val="en-US"/>
+        </w:rPr>
+        <w:t>фокуса</w:t>
+      </w:r>
+      <w:proofErr w:type="spellEnd"/>
+      <w:r>
+        <w:rPr>
+          <w:lang w:val="en-US"/>
+        </w:rPr>
+        <w:t xml:space="preserve">). </w:t>
+      </w:r>
+      <w:proofErr w:type="spellStart"/>
+      <w:r>
+        <w:rPr>
+          <w:lang w:val="en-US"/>
+        </w:rPr>
+        <w:t>DriverFlightConfig</w:t>
+      </w:r>
+      <w:proofErr w:type="spellEnd"/>
+      <w:r>
+        <w:rPr>
+          <w:lang w:val="en-US"/>
+        </w:rPr>
+        <w:t xml:space="preserve"> </w:t>
+      </w:r>
+      <w:proofErr w:type="spellStart"/>
+      <w:r>
+        <w:rPr>
+          <w:lang w:val="en-US"/>
+        </w:rPr>
+        <w:t>появится</w:t>
+      </w:r>
+      <w:proofErr w:type="spellEnd"/>
+      <w:r>
+        <w:rPr>
+          <w:lang w:val="en-US"/>
+        </w:rPr>
+        <w:t xml:space="preserve"> </w:t>
+      </w:r>
+      <w:proofErr w:type="spellStart"/>
+      <w:r>
+        <w:rPr>
+          <w:lang w:val="en-US"/>
+        </w:rPr>
+        <w:t>на</w:t>
+      </w:r>
+      <w:proofErr w:type="spellEnd"/>
+      <w:r>
+        <w:rPr>
+          <w:lang w:val="en-US"/>
+        </w:rPr>
+        <w:t xml:space="preserve"> </w:t>
+      </w:r>
+      <w:proofErr w:type="spellStart"/>
+      <w:r>
+        <w:rPr>
+          <w:lang w:val="en-US"/>
+        </w:rPr>
+        <w:t>шаге</w:t>
+      </w:r>
+      <w:proofErr w:type="spellEnd"/>
+      <w:r>
+        <w:rPr>
+          <w:lang w:val="en-US"/>
+        </w:rPr>
+        <w:t xml:space="preserve"> 7</w:t>
+      </w:r>
+    </w:p>
+    <w:p>
+      <w:pPr>
+        <w:rPr>
+          <w:lang w:val="en-US"/>
+        </w:rPr>
+      </w:pPr>
+      <w:r>
+        <w:rPr>
+          <w:lang w:val="en-US"/>
+        </w:rPr>
+        <w:t xml:space="preserve">- П.6 </w:t>
+      </w:r>
+      <w:proofErr w:type="spellStart"/>
+      <w:r>
+        <w:rPr>
+          <w:lang w:val="en-US"/>
+        </w:rPr>
+        <w:t>DriverController</w:t>
+      </w:r>
+      <w:proofErr w:type="spellEnd"/>
+      <w:r>
+        <w:rPr>
+          <w:lang w:val="en-US"/>
+        </w:rPr>
+        <w:t xml:space="preserve"> </w:t>
+      </w:r>
+      <w:proofErr w:type="spellStart"/>
+      <w:r>
+        <w:rPr>
+          <w:lang w:val="en-US"/>
+        </w:rPr>
+        <w:t>уточнён</w:t>
+      </w:r>
+      <w:proofErr w:type="spellEnd"/>
+      <w:r>
+        <w:rPr>
+          <w:lang w:val="en-US"/>
+        </w:rPr>
+        <w:t xml:space="preserve">: в </w:t>
+      </w:r>
+      <w:proofErr w:type="spellStart"/>
+      <w:r>
+        <w:rPr>
+          <w:lang w:val="en-US"/>
+        </w:rPr>
+        <w:t>машине</w:t>
+      </w:r>
+      <w:proofErr w:type="spellEnd"/>
+      <w:r>
+        <w:rPr>
+          <w:lang w:val="en-US"/>
+        </w:rPr>
+        <w:t xml:space="preserve"> — Animator </w:t>
+      </w:r>
+      <w:proofErr w:type="spellStart"/>
+      <w:r>
+        <w:rPr>
+          <w:lang w:val="en-US"/>
+        </w:rPr>
+        <w:t>играет</w:t>
+      </w:r>
+      <w:proofErr w:type="spellEnd"/>
+      <w:r>
+        <w:rPr>
+          <w:lang w:val="en-US"/>
+        </w:rPr>
+        <w:t xml:space="preserve"> </w:t>
+      </w:r>
+      <w:proofErr w:type="spellStart"/>
+      <w:r>
+        <w:rPr>
+          <w:lang w:val="en-US"/>
+        </w:rPr>
+        <w:t>SitDriver</w:t>
+      </w:r>
+      <w:proofErr w:type="spellEnd"/>
+      <w:r>
+        <w:rPr>
+          <w:lang w:val="en-US"/>
+        </w:rPr>
+        <w:t xml:space="preserve">, </w:t>
+      </w:r>
+      <w:proofErr w:type="spellStart"/>
+      <w:r>
+        <w:rPr>
+          <w:lang w:val="en-US"/>
+        </w:rPr>
+        <w:t>rigidbodies</w:t>
+      </w:r>
+      <w:proofErr w:type="spellEnd"/>
+      <w:r>
+        <w:rPr>
+          <w:lang w:val="en-US"/>
+        </w:rPr>
+        <w:t xml:space="preserve"> kinematic; </w:t>
+      </w:r>
+      <w:proofErr w:type="spellStart"/>
+      <w:r>
+        <w:rPr>
+          <w:lang w:val="en-US"/>
+        </w:rPr>
+        <w:t>на</w:t>
+      </w:r>
+      <w:proofErr w:type="spellEnd"/>
+      <w:r>
+        <w:rPr>
+          <w:lang w:val="en-US"/>
+        </w:rPr>
+        <w:t xml:space="preserve"> Eject(velocity) — Animator off, </w:t>
+      </w:r>
+      <w:proofErr w:type="spellStart"/>
+      <w:r>
+        <w:rPr>
+          <w:lang w:val="en-US"/>
+        </w:rPr>
+        <w:t>кости</w:t>
+      </w:r>
+      <w:proofErr w:type="spellEnd"/>
+      <w:r>
+        <w:rPr>
+          <w:lang w:val="en-US"/>
+        </w:rPr>
+        <w:t xml:space="preserve"> dynamic, </w:t>
+      </w:r>
+      <w:proofErr w:type="spellStart"/>
+      <w:r>
+        <w:rPr>
+          <w:lang w:val="en-US"/>
+        </w:rPr>
+        <w:t>импульс</w:t>
+      </w:r>
+      <w:proofErr w:type="spellEnd"/>
+      <w:r>
+        <w:rPr>
+          <w:lang w:val="en-US"/>
+        </w:rPr>
+        <w:t>.</w:t>
+      </w:r>
+    </w:p>
+    <w:p>
+      <w:pPr>
+        <w:rPr>
+          <w:lang w:val="en-US"/>
+        </w:rPr>
+      </w:pPr>
+      <w:r>
+        <w:rPr>
+          <w:lang w:val="en-US"/>
+        </w:rPr>
+        <w:t xml:space="preserve">- </w:t>
+      </w:r>
+      <w:proofErr w:type="spellStart"/>
+      <w:r>
+        <w:rPr>
+          <w:lang w:val="en-US"/>
+        </w:rPr>
+        <w:t>Новый</w:t>
+      </w:r>
+      <w:proofErr w:type="spellEnd"/>
+      <w:r>
+        <w:rPr>
+          <w:lang w:val="en-US"/>
+        </w:rPr>
+        <w:t xml:space="preserve"> </w:t>
+      </w:r>
+      <w:proofErr w:type="spellStart"/>
+      <w:r>
+        <w:rPr>
+          <w:lang w:val="en-US"/>
+        </w:rPr>
+        <w:t>пункт</w:t>
+      </w:r>
+      <w:proofErr w:type="spellEnd"/>
+      <w:r>
+        <w:rPr>
+          <w:lang w:val="en-US"/>
+        </w:rPr>
+        <w:t xml:space="preserve"> 5b: editor-</w:t>
+      </w:r>
+      <w:proofErr w:type="spellStart"/>
+      <w:r>
+        <w:rPr>
+          <w:lang w:val="en-US"/>
+        </w:rPr>
+        <w:t>скрипт</w:t>
+      </w:r>
+      <w:proofErr w:type="spellEnd"/>
+      <w:r>
+        <w:rPr>
+          <w:lang w:val="en-US"/>
+        </w:rPr>
+        <w:t xml:space="preserve"> </w:t>
+      </w:r>
+      <w:proofErr w:type="spellStart"/>
+      <w:r>
+        <w:rPr>
+          <w:lang w:val="en-US"/>
+        </w:rPr>
+        <w:t>создаёт</w:t>
+      </w:r>
+      <w:proofErr w:type="spellEnd"/>
+      <w:r>
+        <w:rPr>
+          <w:lang w:val="en-US"/>
+        </w:rPr>
+        <w:t xml:space="preserve"> </w:t>
+      </w:r>
+      <w:proofErr w:type="spellStart"/>
+      <w:r>
+        <w:rPr>
+          <w:lang w:val="en-US"/>
+        </w:rPr>
+        <w:t>AnimatorController</w:t>
+      </w:r>
+      <w:proofErr w:type="spellEnd"/>
+      <w:r>
+        <w:rPr>
+          <w:lang w:val="en-US"/>
+        </w:rPr>
+        <w:t xml:space="preserve"> (</w:t>
+      </w:r>
+      <w:proofErr w:type="spellStart"/>
+      <w:r>
+        <w:rPr>
+          <w:lang w:val="en-US"/>
+        </w:rPr>
+        <w:t>один</w:t>
+      </w:r>
+      <w:proofErr w:type="spellEnd"/>
+      <w:r>
+        <w:rPr>
+          <w:lang w:val="en-US"/>
+        </w:rPr>
+        <w:t xml:space="preserve"> state Sit с </w:t>
+      </w:r>
+      <w:proofErr w:type="spellStart"/>
+      <w:r>
+        <w:rPr>
+          <w:lang w:val="en-US"/>
+        </w:rPr>
+        <w:t>клипом</w:t>
+      </w:r>
+      <w:proofErr w:type="spellEnd"/>
+      <w:r>
+        <w:rPr>
+          <w:lang w:val="en-US"/>
+        </w:rPr>
+        <w:t xml:space="preserve"> </w:t>
+      </w:r>
+      <w:proofErr w:type="spellStart"/>
+      <w:r>
+        <w:rPr>
+          <w:lang w:val="en-US"/>
+        </w:rPr>
+        <w:t>SitDriver</w:t>
+      </w:r>
+      <w:proofErr w:type="spellEnd"/>
+      <w:r>
+        <w:rPr>
+          <w:lang w:val="en-US"/>
+        </w:rPr>
+        <w:t xml:space="preserve">) — </w:t>
+      </w:r>
+      <w:proofErr w:type="spellStart"/>
+      <w:r>
+        <w:rPr>
+          <w:lang w:val="en-US"/>
+        </w:rPr>
+        <w:t>наш</w:t>
+      </w:r>
+      <w:proofErr w:type="spellEnd"/>
+      <w:r>
+        <w:rPr>
+          <w:lang w:val="en-US"/>
+        </w:rPr>
+        <w:t xml:space="preserve"> </w:t>
+      </w:r>
+      <w:proofErr w:type="spellStart"/>
+      <w:r>
+        <w:rPr>
+          <w:lang w:val="en-US"/>
+        </w:rPr>
+        <w:t>ассет</w:t>
+      </w:r>
+      <w:proofErr w:type="spellEnd"/>
+      <w:r>
+        <w:rPr>
+          <w:lang w:val="en-US"/>
+        </w:rPr>
+        <w:t>, Assets/Development/Art/Animations/</w:t>
+      </w:r>
+      <w:proofErr w:type="spellStart"/>
+      <w:r>
+        <w:rPr>
+          <w:lang w:val="en-US"/>
+        </w:rPr>
+        <w:t>AC_DriverSit.controller</w:t>
+      </w:r>
+      <w:proofErr w:type="spellEnd"/>
+      <w:r>
+        <w:rPr>
+          <w:lang w:val="en-US"/>
+        </w:rPr>
+        <w:t>.</w:t>
+      </w:r>
+    </w:p>
+    <w:p>
+      <w:pPr>
+        <w:rPr>
+          <w:lang w:val="en-US"/>
+        </w:rPr>
+      </w:pPr>
+      <w:r>
+        <w:rPr>
+          <w:lang w:val="en-US"/>
+        </w:rPr>
+        <w:t xml:space="preserve">- П.14 Build Driver Ragdoll Prefab: </w:t>
+      </w:r>
+      <w:proofErr w:type="spellStart"/>
+      <w:r>
+        <w:rPr>
+          <w:lang w:val="en-US"/>
+        </w:rPr>
+        <w:t>источник</w:t>
+      </w:r>
+      <w:proofErr w:type="spellEnd"/>
+      <w:r>
+        <w:rPr>
+          <w:lang w:val="en-US"/>
+        </w:rPr>
+        <w:t xml:space="preserve"> — </w:t>
+      </w:r>
+      <w:proofErr w:type="spellStart"/>
+      <w:r>
+        <w:rPr>
+          <w:lang w:val="en-US"/>
+        </w:rPr>
+        <w:t>выделенный</w:t>
+      </w:r>
+      <w:proofErr w:type="spellEnd"/>
+      <w:r>
+        <w:rPr>
+          <w:lang w:val="en-US"/>
+        </w:rPr>
+        <w:t xml:space="preserve"> </w:t>
+      </w:r>
+      <w:proofErr w:type="spellStart"/>
+      <w:r>
+        <w:rPr>
+          <w:lang w:val="en-US"/>
+        </w:rPr>
+        <w:t>префаб</w:t>
+      </w:r>
+      <w:proofErr w:type="spellEnd"/>
+      <w:r>
+        <w:rPr>
+          <w:lang w:val="en-US"/>
+        </w:rPr>
+        <w:t xml:space="preserve"> </w:t>
+      </w:r>
+      <w:proofErr w:type="spellStart"/>
+      <w:r>
+        <w:rPr>
+          <w:lang w:val="en-US"/>
+        </w:rPr>
+        <w:t>из</w:t>
+      </w:r>
+      <w:proofErr w:type="spellEnd"/>
+      <w:r>
+        <w:rPr>
+          <w:lang w:val="en-US"/>
+        </w:rPr>
+        <w:t xml:space="preserve"> ThirdParty/DriverAvatars/npc_casual_set_00/Prefabs/npc_csl_00_character_* (</w:t>
+      </w:r>
+      <w:proofErr w:type="spellStart"/>
+      <w:r>
+        <w:rPr>
+          <w:lang w:val="en-US"/>
+        </w:rPr>
+        <w:t>дефолт</w:t>
+      </w:r>
+      <w:proofErr w:type="spellEnd"/>
+      <w:r>
+        <w:rPr>
+          <w:lang w:val="en-US"/>
+        </w:rPr>
+        <w:t xml:space="preserve"> — 01m_01), ragdoll-</w:t>
+      </w:r>
+      <w:proofErr w:type="spellStart"/>
+      <w:r>
+        <w:rPr>
+          <w:lang w:val="en-US"/>
+        </w:rPr>
+        <w:t>кости</w:t>
+      </w:r>
+      <w:proofErr w:type="spellEnd"/>
+      <w:r>
+        <w:rPr>
+          <w:lang w:val="en-US"/>
+        </w:rPr>
+        <w:t xml:space="preserve"> </w:t>
+      </w:r>
+      <w:proofErr w:type="spellStart"/>
+      <w:r>
+        <w:rPr>
+          <w:lang w:val="en-US"/>
+        </w:rPr>
+        <w:t>добавляются</w:t>
+      </w:r>
+      <w:proofErr w:type="spellEnd"/>
+      <w:r>
+        <w:rPr>
+          <w:lang w:val="en-US"/>
+        </w:rPr>
+        <w:t xml:space="preserve"> </w:t>
+      </w:r>
+      <w:proofErr w:type="spellStart"/>
+      <w:r>
+        <w:rPr>
+          <w:lang w:val="en-US"/>
+        </w:rPr>
+        <w:t>программно</w:t>
+      </w:r>
+      <w:proofErr w:type="spellEnd"/>
+      <w:r>
+        <w:rPr>
+          <w:lang w:val="en-US"/>
+        </w:rPr>
+        <w:t xml:space="preserve"> (</w:t>
+      </w:r>
+      <w:proofErr w:type="spellStart"/>
+      <w:r>
+        <w:rPr>
+          <w:lang w:val="en-US"/>
+        </w:rPr>
+        <w:t>без</w:t>
+      </w:r>
+      <w:proofErr w:type="spellEnd"/>
+      <w:r>
+        <w:rPr>
+          <w:lang w:val="en-US"/>
+        </w:rPr>
+        <w:t xml:space="preserve"> Ragdoll Wizard), Animator с </w:t>
+      </w:r>
+      <w:proofErr w:type="spellStart"/>
+      <w:r>
+        <w:rPr>
+          <w:lang w:val="en-US"/>
+        </w:rPr>
+        <w:t>AC_DriverSit</w:t>
+      </w:r>
+      <w:proofErr w:type="spellEnd"/>
+      <w:r>
+        <w:rPr>
+          <w:lang w:val="en-US"/>
+        </w:rPr>
+        <w:t xml:space="preserve"> </w:t>
+      </w:r>
+      <w:proofErr w:type="spellStart"/>
+      <w:r>
+        <w:rPr>
+          <w:lang w:val="en-US"/>
+        </w:rPr>
+        <w:t>вешается</w:t>
+      </w:r>
+      <w:proofErr w:type="spellEnd"/>
+      <w:r>
+        <w:rPr>
+          <w:lang w:val="en-US"/>
+        </w:rPr>
+        <w:t xml:space="preserve"> </w:t>
+      </w:r>
+      <w:proofErr w:type="spellStart"/>
+      <w:r>
+        <w:rPr>
+          <w:lang w:val="en-US"/>
+        </w:rPr>
+        <w:t>сразу</w:t>
+      </w:r>
+      <w:proofErr w:type="spellEnd"/>
+      <w:r>
+        <w:rPr>
+          <w:lang w:val="en-US"/>
+        </w:rPr>
+        <w:t xml:space="preserve">. </w:t>
+      </w:r>
+      <w:proofErr w:type="spellStart"/>
+      <w:r>
+        <w:rPr>
+          <w:lang w:val="en-US"/>
+        </w:rPr>
+        <w:t>Результат</w:t>
+      </w:r>
+      <w:proofErr w:type="spellEnd"/>
+      <w:r>
+        <w:rPr>
+          <w:lang w:val="en-US"/>
+        </w:rPr>
+        <w:t>: Development/Prefabs/Characters/</w:t>
+      </w:r>
+      <w:proofErr w:type="spellStart"/>
+      <w:r>
+        <w:rPr>
+          <w:lang w:val="en-US"/>
+        </w:rPr>
+        <w:t>Driver_Default.prefab</w:t>
+      </w:r>
+      <w:proofErr w:type="spellEnd"/>
+      <w:r>
+        <w:rPr>
+          <w:lang w:val="en-US"/>
+        </w:rPr>
+        <w:t>.</w:t>
+      </w:r>
+    </w:p>
+    <w:p>
+      <w:pPr>
+        <w:rPr>
+          <w:lang w:val="en-US"/>
+        </w:rPr>
+      </w:pPr>
+      <w:r>
+        <w:rPr>
+          <w:lang w:val="en-US"/>
+        </w:rPr>
+        <w:t xml:space="preserve">- </w:t>
+      </w:r>
+      <w:proofErr w:type="spellStart"/>
+      <w:r>
+        <w:rPr>
+          <w:lang w:val="en-US"/>
+        </w:rPr>
+        <w:t>Разные</w:t>
+      </w:r>
+      <w:proofErr w:type="spellEnd"/>
+      <w:r>
+        <w:rPr>
+          <w:lang w:val="en-US"/>
+        </w:rPr>
+        <w:t xml:space="preserve"> </w:t>
+      </w:r>
+      <w:proofErr w:type="spellStart"/>
+      <w:r>
+        <w:rPr>
+          <w:lang w:val="en-US"/>
+        </w:rPr>
+        <w:t>аватары</w:t>
+      </w:r>
+      <w:proofErr w:type="spellEnd"/>
+      <w:r>
+        <w:rPr>
+          <w:lang w:val="en-US"/>
+        </w:rPr>
+        <w:t xml:space="preserve"> </w:t>
+      </w:r>
+      <w:proofErr w:type="spellStart"/>
+      <w:r>
+        <w:rPr>
+          <w:lang w:val="en-US"/>
+        </w:rPr>
+        <w:t>на</w:t>
+      </w:r>
+      <w:proofErr w:type="spellEnd"/>
+      <w:r>
+        <w:rPr>
+          <w:lang w:val="en-US"/>
+        </w:rPr>
+        <w:t xml:space="preserve"> </w:t>
+      </w:r>
+      <w:proofErr w:type="spellStart"/>
+      <w:r>
+        <w:rPr>
+          <w:lang w:val="en-US"/>
+        </w:rPr>
+        <w:t>разных</w:t>
+      </w:r>
+      <w:proofErr w:type="spellEnd"/>
+      <w:r>
+        <w:rPr>
+          <w:lang w:val="en-US"/>
+        </w:rPr>
+        <w:t xml:space="preserve"> </w:t>
+      </w:r>
+      <w:proofErr w:type="spellStart"/>
+      <w:r>
+        <w:rPr>
+          <w:lang w:val="en-US"/>
+        </w:rPr>
+        <w:t>машинах</w:t>
+      </w:r>
+      <w:proofErr w:type="spellEnd"/>
+      <w:r>
+        <w:rPr>
+          <w:lang w:val="en-US"/>
+        </w:rPr>
+        <w:t xml:space="preserve"> — </w:t>
+      </w:r>
+      <w:proofErr w:type="spellStart"/>
+      <w:r>
+        <w:rPr>
+          <w:lang w:val="en-US"/>
+        </w:rPr>
+        <w:t>это</w:t>
+      </w:r>
+      <w:proofErr w:type="spellEnd"/>
+      <w:r>
+        <w:rPr>
+          <w:lang w:val="en-US"/>
+        </w:rPr>
+        <w:t xml:space="preserve"> pure content (§14.1), </w:t>
+      </w:r>
+      <w:proofErr w:type="spellStart"/>
+      <w:r>
+        <w:rPr>
+          <w:lang w:val="en-US"/>
+        </w:rPr>
+        <w:t>позже</w:t>
+      </w:r>
+      <w:proofErr w:type="spellEnd"/>
+      <w:r>
+        <w:rPr>
+          <w:lang w:val="en-US"/>
+        </w:rPr>
+        <w:t xml:space="preserve"> </w:t>
+      </w:r>
+      <w:proofErr w:type="spellStart"/>
+      <w:r>
+        <w:rPr>
+          <w:lang w:val="en-US"/>
+        </w:rPr>
+        <w:t>без</w:t>
+      </w:r>
+      <w:proofErr w:type="spellEnd"/>
+      <w:r>
+        <w:rPr>
+          <w:lang w:val="en-US"/>
+        </w:rPr>
+        <w:t xml:space="preserve"> </w:t>
+      </w:r>
+      <w:proofErr w:type="spellStart"/>
+      <w:r>
+        <w:rPr>
+          <w:lang w:val="en-US"/>
+        </w:rPr>
+        <w:t>кода</w:t>
+      </w:r>
+      <w:proofErr w:type="spellEnd"/>
+      <w:r>
+        <w:rPr>
+          <w:lang w:val="en-US"/>
+        </w:rPr>
+        <w:t>.</w:t>
+      </w:r>
+    </w:p>
+    <w:p>
+      <w:pPr>
+        <w:rPr>
+          <w:lang w:val="en-US"/>
+        </w:rPr>
+      </w:pPr>
+    </w:p>
+    <w:p>
+      <w:pPr>
+        <w:rPr>
+          <w:lang w:val="en-US"/>
+        </w:rPr>
+      </w:pPr>
+      <w:r>
+        <w:rPr>
+          <w:lang w:val="en-US"/>
+        </w:rPr>
+        <w:t xml:space="preserve">3. </w:t>
+      </w:r>
+      <w:proofErr w:type="spellStart"/>
+      <w:r>
+        <w:rPr>
+          <w:lang w:val="en-US"/>
+        </w:rPr>
+        <w:t>Нюанс</w:t>
+      </w:r>
+      <w:proofErr w:type="spellEnd"/>
+      <w:r>
+        <w:rPr>
+          <w:lang w:val="en-US"/>
+        </w:rPr>
+        <w:t xml:space="preserve"> </w:t>
+      </w:r>
+      <w:proofErr w:type="spellStart"/>
+      <w:r>
+        <w:rPr>
+          <w:lang w:val="en-US"/>
+        </w:rPr>
+        <w:t>по</w:t>
+      </w:r>
+      <w:proofErr w:type="spellEnd"/>
+      <w:r>
+        <w:rPr>
+          <w:lang w:val="en-US"/>
+        </w:rPr>
+        <w:t xml:space="preserve"> </w:t>
+      </w:r>
+      <w:proofErr w:type="spellStart"/>
+      <w:r>
+        <w:rPr>
+          <w:lang w:val="en-US"/>
+        </w:rPr>
+        <w:t>папке</w:t>
+      </w:r>
+      <w:proofErr w:type="spellEnd"/>
+      <w:r>
+        <w:rPr>
+          <w:lang w:val="en-US"/>
+        </w:rPr>
+        <w:t xml:space="preserve">: Assets/Content/ </w:t>
+      </w:r>
+      <w:proofErr w:type="spellStart"/>
+      <w:r>
+        <w:rPr>
+          <w:lang w:val="en-US"/>
+        </w:rPr>
+        <w:t>не</w:t>
+      </w:r>
+      <w:proofErr w:type="spellEnd"/>
+      <w:r>
+        <w:rPr>
+          <w:lang w:val="en-US"/>
+        </w:rPr>
+        <w:t xml:space="preserve"> </w:t>
+      </w:r>
+      <w:proofErr w:type="spellStart"/>
+      <w:r>
+        <w:rPr>
+          <w:lang w:val="en-US"/>
+        </w:rPr>
+        <w:t>предусмотрена</w:t>
+      </w:r>
+      <w:proofErr w:type="spellEnd"/>
+      <w:r>
+        <w:rPr>
+          <w:lang w:val="en-US"/>
+        </w:rPr>
+        <w:t xml:space="preserve"> </w:t>
+      </w:r>
+      <w:proofErr w:type="spellStart"/>
+      <w:r>
+        <w:rPr>
+          <w:lang w:val="en-US"/>
+        </w:rPr>
+        <w:t>правилами</w:t>
+      </w:r>
+      <w:proofErr w:type="spellEnd"/>
+      <w:r>
+        <w:rPr>
+          <w:lang w:val="en-US"/>
+        </w:rPr>
+        <w:t xml:space="preserve"> </w:t>
+      </w:r>
+      <w:proofErr w:type="spellStart"/>
+      <w:r>
+        <w:rPr>
+          <w:lang w:val="en-US"/>
+        </w:rPr>
+        <w:t>хранения</w:t>
+      </w:r>
+      <w:proofErr w:type="spellEnd"/>
+      <w:r>
+        <w:rPr>
+          <w:lang w:val="en-US"/>
+        </w:rPr>
+        <w:t xml:space="preserve"> (</w:t>
+      </w:r>
+      <w:proofErr w:type="spellStart"/>
+      <w:r>
+        <w:rPr>
+          <w:lang w:val="en-US"/>
+        </w:rPr>
+        <w:t>наш</w:t>
+      </w:r>
+      <w:proofErr w:type="spellEnd"/>
+      <w:r>
+        <w:rPr>
+          <w:lang w:val="en-US"/>
+        </w:rPr>
+        <w:t xml:space="preserve"> </w:t>
+      </w:r>
+      <w:proofErr w:type="spellStart"/>
+      <w:r>
+        <w:rPr>
+          <w:lang w:val="en-US"/>
+        </w:rPr>
+        <w:t>контент</w:t>
+      </w:r>
+      <w:proofErr w:type="spellEnd"/>
+      <w:r>
+        <w:rPr>
+          <w:lang w:val="en-US"/>
+        </w:rPr>
+        <w:t xml:space="preserve"> → Development/, </w:t>
+      </w:r>
+      <w:proofErr w:type="spellStart"/>
+      <w:r>
+        <w:rPr>
+          <w:lang w:val="en-US"/>
+        </w:rPr>
+        <w:t>покупной</w:t>
+      </w:r>
+      <w:proofErr w:type="spellEnd"/>
+      <w:r>
+        <w:rPr>
+          <w:lang w:val="en-US"/>
+        </w:rPr>
+        <w:t xml:space="preserve"> → </w:t>
+      </w:r>
+      <w:proofErr w:type="spellStart"/>
+      <w:r>
+        <w:rPr>
+          <w:lang w:val="en-US"/>
+        </w:rPr>
+        <w:t>ThirdParty</w:t>
+      </w:r>
+      <w:proofErr w:type="spellEnd"/>
+      <w:r>
+        <w:rPr>
+          <w:lang w:val="en-US"/>
+        </w:rPr>
+        <w:t xml:space="preserve">/). </w:t>
+      </w:r>
+      <w:proofErr w:type="spellStart"/>
+      <w:r>
+        <w:rPr>
+          <w:lang w:val="en-US"/>
+        </w:rPr>
+        <w:t>Клип</w:t>
+      </w:r>
+      <w:proofErr w:type="spellEnd"/>
+      <w:r>
+        <w:rPr>
+          <w:lang w:val="en-US"/>
+        </w:rPr>
+        <w:t xml:space="preserve"> </w:t>
+      </w:r>
+      <w:proofErr w:type="spellStart"/>
+      <w:r>
+        <w:rPr>
+          <w:lang w:val="en-US"/>
+        </w:rPr>
+        <w:t>SitDriver.anim</w:t>
+      </w:r>
+      <w:proofErr w:type="spellEnd"/>
+      <w:r>
+        <w:rPr>
+          <w:lang w:val="en-US"/>
+        </w:rPr>
+        <w:t xml:space="preserve"> </w:t>
+      </w:r>
+      <w:proofErr w:type="spellStart"/>
+      <w:r>
+        <w:rPr>
+          <w:lang w:val="en-US"/>
+        </w:rPr>
+        <w:t>предлагаю</w:t>
+      </w:r>
+      <w:proofErr w:type="spellEnd"/>
+      <w:r>
+        <w:rPr>
+          <w:lang w:val="en-US"/>
+        </w:rPr>
+        <w:t xml:space="preserve"> </w:t>
+      </w:r>
+    </w:p>
+    <w:p>
+      <w:pPr>
+        <w:rPr>
+          <w:lang w:val="en-US"/>
+        </w:rPr>
+      </w:pPr>
+      <w:r>
+        <w:rPr>
+          <w:lang w:val="en-US"/>
+        </w:rPr>
+        <w:t xml:space="preserve">- </w:t>
+      </w:r>
+      <w:proofErr w:type="spellStart"/>
+      <w:r>
+        <w:rPr>
+          <w:lang w:val="en-US"/>
+        </w:rPr>
+        <w:t>Новый</w:t>
+      </w:r>
+      <w:proofErr w:type="spellEnd"/>
+      <w:r>
+        <w:rPr>
+          <w:lang w:val="en-US"/>
+        </w:rPr>
+        <w:t xml:space="preserve"> </w:t>
+      </w:r>
+      <w:proofErr w:type="spellStart"/>
+      <w:r>
+        <w:rPr>
+          <w:lang w:val="en-US"/>
+        </w:rPr>
+        <w:t>пункт</w:t>
+      </w:r>
+      <w:proofErr w:type="spellEnd"/>
+      <w:r>
+        <w:rPr>
+          <w:lang w:val="en-US"/>
+        </w:rPr>
+        <w:t xml:space="preserve"> 5b: editor-</w:t>
+      </w:r>
+      <w:proofErr w:type="spellStart"/>
+      <w:r>
+        <w:rPr>
+          <w:lang w:val="en-US"/>
+        </w:rPr>
+        <w:t>скрипт</w:t>
+      </w:r>
+      <w:proofErr w:type="spellEnd"/>
+      <w:r>
+        <w:rPr>
+          <w:lang w:val="en-US"/>
+        </w:rPr>
+        <w:t xml:space="preserve"> </w:t>
+      </w:r>
+      <w:proofErr w:type="spellStart"/>
+      <w:r>
+        <w:rPr>
+          <w:lang w:val="en-US"/>
+        </w:rPr>
+        <w:t>создаёт</w:t>
+      </w:r>
+      <w:proofErr w:type="spellEnd"/>
+      <w:r>
+        <w:rPr>
+          <w:lang w:val="en-US"/>
+        </w:rPr>
+        <w:t xml:space="preserve"> </w:t>
+      </w:r>
+      <w:proofErr w:type="spellStart"/>
+      <w:r>
+        <w:rPr>
+          <w:lang w:val="en-US"/>
+        </w:rPr>
+        <w:t>AnimatorController</w:t>
+      </w:r>
+      <w:proofErr w:type="spellEnd"/>
+      <w:r>
+        <w:rPr>
+          <w:lang w:val="en-US"/>
+        </w:rPr>
+        <w:t xml:space="preserve"> (</w:t>
+      </w:r>
+      <w:proofErr w:type="spellStart"/>
+      <w:r>
+        <w:rPr>
+          <w:lang w:val="en-US"/>
+        </w:rPr>
+        <w:t>один</w:t>
+      </w:r>
+      <w:proofErr w:type="spellEnd"/>
+      <w:r>
+        <w:rPr>
+          <w:lang w:val="en-US"/>
+        </w:rPr>
+        <w:t xml:space="preserve"> state Sit с </w:t>
+      </w:r>
+      <w:proofErr w:type="spellStart"/>
+      <w:r>
+        <w:rPr>
+          <w:lang w:val="en-US"/>
+        </w:rPr>
+        <w:t>клипом</w:t>
+      </w:r>
+      <w:proofErr w:type="spellEnd"/>
+      <w:r>
+        <w:rPr>
+          <w:lang w:val="en-US"/>
+        </w:rPr>
+        <w:t xml:space="preserve"> </w:t>
+      </w:r>
+      <w:proofErr w:type="spellStart"/>
+      <w:r>
+        <w:rPr>
+          <w:lang w:val="en-US"/>
+        </w:rPr>
+        <w:t>SitDriver</w:t>
+      </w:r>
+      <w:proofErr w:type="spellEnd"/>
+      <w:r>
+        <w:rPr>
+          <w:lang w:val="en-US"/>
+        </w:rPr>
+        <w:t xml:space="preserve">) — </w:t>
+      </w:r>
+      <w:proofErr w:type="spellStart"/>
+      <w:r>
+        <w:rPr>
+          <w:lang w:val="en-US"/>
+        </w:rPr>
+        <w:t>наш</w:t>
+      </w:r>
+      <w:proofErr w:type="spellEnd"/>
+      <w:r>
+        <w:rPr>
+          <w:lang w:val="en-US"/>
+        </w:rPr>
+        <w:t xml:space="preserve"> </w:t>
+      </w:r>
+      <w:proofErr w:type="spellStart"/>
+      <w:r>
+        <w:rPr>
+          <w:lang w:val="en-US"/>
+        </w:rPr>
+        <w:t>ассет</w:t>
+      </w:r>
+      <w:proofErr w:type="spellEnd"/>
+      <w:r>
+        <w:rPr>
+          <w:lang w:val="en-US"/>
+        </w:rPr>
+        <w:t>, Assets/Development/Art/Animations/</w:t>
+      </w:r>
+      <w:proofErr w:type="spellStart"/>
+      <w:r>
+        <w:rPr>
+          <w:lang w:val="en-US"/>
+        </w:rPr>
+        <w:t>AC_DriverSit.controller</w:t>
+      </w:r>
+      <w:proofErr w:type="spellEnd"/>
+      <w:r>
+        <w:rPr>
+          <w:lang w:val="en-US"/>
+        </w:rPr>
+        <w:t>.</w:t>
+      </w:r>
+    </w:p>
+    <w:p>
+      <w:pPr>
+        <w:rPr>
+          <w:lang w:val="en-US"/>
+        </w:rPr>
+      </w:pPr>
+      <w:r>
+        <w:rPr>
+          <w:lang w:val="en-US"/>
+        </w:rPr>
+        <w:t xml:space="preserve">- П.14 Build Driver Ragdoll Prefab: </w:t>
+      </w:r>
+      <w:proofErr w:type="spellStart"/>
+      <w:r>
+        <w:rPr>
+          <w:lang w:val="en-US"/>
+        </w:rPr>
+        <w:t>источник</w:t>
+      </w:r>
+      <w:proofErr w:type="spellEnd"/>
+      <w:r>
+        <w:rPr>
+          <w:lang w:val="en-US"/>
+        </w:rPr>
+        <w:t xml:space="preserve"> — </w:t>
+      </w:r>
+      <w:proofErr w:type="spellStart"/>
+      <w:r>
+        <w:rPr>
+          <w:lang w:val="en-US"/>
+        </w:rPr>
+        <w:t>выделенный</w:t>
+      </w:r>
+      <w:proofErr w:type="spellEnd"/>
+      <w:r>
+        <w:rPr>
+          <w:lang w:val="en-US"/>
+        </w:rPr>
+        <w:t xml:space="preserve"> </w:t>
+      </w:r>
+      <w:proofErr w:type="spellStart"/>
+      <w:r>
+        <w:rPr>
+          <w:lang w:val="en-US"/>
+        </w:rPr>
+        <w:t>префаб</w:t>
+      </w:r>
+      <w:proofErr w:type="spellEnd"/>
+      <w:r>
+        <w:rPr>
+          <w:lang w:val="en-US"/>
+        </w:rPr>
+        <w:t xml:space="preserve"> </w:t>
+      </w:r>
+      <w:proofErr w:type="spellStart"/>
+      <w:r>
+        <w:rPr>
+          <w:lang w:val="en-US"/>
+        </w:rPr>
+        <w:t>из</w:t>
+      </w:r>
+      <w:proofErr w:type="spellEnd"/>
+      <w:r>
+        <w:rPr>
+          <w:lang w:val="en-US"/>
+        </w:rPr>
+        <w:t xml:space="preserve"> ThirdParty/DriverAvatars/npc_casual_set_00/Prefabs/npc_csl_00_character_* (</w:t>
+      </w:r>
+      <w:proofErr w:type="spellStart"/>
+      <w:r>
+        <w:rPr>
+          <w:lang w:val="en-US"/>
+        </w:rPr>
+        <w:t>дефолт</w:t>
+      </w:r>
+      <w:proofErr w:type="spellEnd"/>
+      <w:r>
+        <w:rPr>
+          <w:lang w:val="en-US"/>
+        </w:rPr>
+        <w:t xml:space="preserve"> — 01m_01), ragdoll-</w:t>
+      </w:r>
+      <w:proofErr w:type="spellStart"/>
+      <w:r>
+        <w:rPr>
+          <w:lang w:val="en-US"/>
+        </w:rPr>
+        <w:t>кости</w:t>
+      </w:r>
+      <w:proofErr w:type="spellEnd"/>
+      <w:r>
+        <w:rPr>
+          <w:lang w:val="en-US"/>
+        </w:rPr>
+        <w:t xml:space="preserve"> </w:t>
+      </w:r>
+      <w:proofErr w:type="spellStart"/>
+      <w:r>
+        <w:rPr>
+          <w:lang w:val="en-US"/>
+        </w:rPr>
+        <w:t>добавляются</w:t>
+      </w:r>
+      <w:proofErr w:type="spellEnd"/>
+      <w:r>
+        <w:rPr>
+          <w:lang w:val="en-US"/>
+        </w:rPr>
+        <w:t xml:space="preserve"> </w:t>
+      </w:r>
+      <w:proofErr w:type="spellStart"/>
+      <w:r>
+        <w:rPr>
+          <w:lang w:val="en-US"/>
+        </w:rPr>
+        <w:t>программно</w:t>
+      </w:r>
+      <w:proofErr w:type="spellEnd"/>
+      <w:r>
+        <w:rPr>
+          <w:lang w:val="en-US"/>
+        </w:rPr>
+        <w:t xml:space="preserve"> (</w:t>
+      </w:r>
+      <w:proofErr w:type="spellStart"/>
+      <w:r>
+        <w:rPr>
+          <w:lang w:val="en-US"/>
+        </w:rPr>
+        <w:t>без</w:t>
+      </w:r>
+      <w:proofErr w:type="spellEnd"/>
+      <w:r>
+        <w:rPr>
+          <w:lang w:val="en-US"/>
+        </w:rPr>
+        <w:t xml:space="preserve"> Ragdoll Wizard), Animator с </w:t>
+      </w:r>
+      <w:proofErr w:type="spellStart"/>
+      <w:r>
+        <w:rPr>
+          <w:lang w:val="en-US"/>
+        </w:rPr>
+        <w:t>AC_DriverSit</w:t>
+      </w:r>
+      <w:proofErr w:type="spellEnd"/>
+      <w:r>
+        <w:rPr>
+          <w:lang w:val="en-US"/>
+        </w:rPr>
+        <w:t xml:space="preserve"> </w:t>
+      </w:r>
+      <w:proofErr w:type="spellStart"/>
+      <w:r>
+        <w:rPr>
+          <w:lang w:val="en-US"/>
+        </w:rPr>
+        <w:t>вешается</w:t>
+      </w:r>
+      <w:proofErr w:type="spellEnd"/>
+      <w:r>
+        <w:rPr>
+          <w:lang w:val="en-US"/>
+        </w:rPr>
+        <w:t xml:space="preserve"> </w:t>
+      </w:r>
+      <w:proofErr w:type="spellStart"/>
+      <w:r>
+        <w:rPr>
+          <w:lang w:val="en-US"/>
+        </w:rPr>
+        <w:t>сразу</w:t>
+      </w:r>
+      <w:proofErr w:type="spellEnd"/>
+      <w:r>
+        <w:rPr>
+          <w:lang w:val="en-US"/>
+        </w:rPr>
+        <w:t xml:space="preserve">. </w:t>
+      </w:r>
+      <w:proofErr w:type="spellStart"/>
+      <w:r>
+        <w:rPr>
+          <w:lang w:val="en-US"/>
+        </w:rPr>
+        <w:t>Результат</w:t>
+      </w:r>
+      <w:proofErr w:type="spellEnd"/>
+      <w:r>
+        <w:rPr>
+          <w:lang w:val="en-US"/>
+        </w:rPr>
+        <w:t>: Development/Prefabs/Characters/</w:t>
+      </w:r>
+      <w:proofErr w:type="spellStart"/>
+      <w:r>
+        <w:rPr>
+          <w:lang w:val="en-US"/>
+        </w:rPr>
+        <w:t>Driver_Default.prefab</w:t>
+      </w:r>
+      <w:proofErr w:type="spellEnd"/>
+      <w:r>
+        <w:rPr>
+          <w:lang w:val="en-US"/>
+        </w:rPr>
+        <w:t>.</w:t>
+      </w:r>
+    </w:p>
+    <w:p>
+      <w:pPr>
+        <w:rPr>
+          <w:lang w:val="en-US"/>
+        </w:rPr>
+      </w:pPr>
+      <w:r>
+        <w:rPr>
+          <w:lang w:val="en-US"/>
+        </w:rPr>
+        <w:t xml:space="preserve">- </w:t>
+      </w:r>
+      <w:proofErr w:type="spellStart"/>
+      <w:r>
+        <w:rPr>
+          <w:lang w:val="en-US"/>
+        </w:rPr>
+        <w:t>Разные</w:t>
+      </w:r>
+      <w:proofErr w:type="spellEnd"/>
+      <w:r>
+        <w:rPr>
+          <w:lang w:val="en-US"/>
+        </w:rPr>
+        <w:t xml:space="preserve"> </w:t>
+      </w:r>
+      <w:proofErr w:type="spellStart"/>
+      <w:r>
+        <w:rPr>
+          <w:lang w:val="en-US"/>
+        </w:rPr>
+        <w:t>аватары</w:t>
+      </w:r>
+      <w:proofErr w:type="spellEnd"/>
+      <w:r>
+        <w:rPr>
+          <w:lang w:val="en-US"/>
+        </w:rPr>
+        <w:t xml:space="preserve"> </w:t>
+      </w:r>
+      <w:proofErr w:type="spellStart"/>
+      <w:r>
+        <w:rPr>
+          <w:lang w:val="en-US"/>
+        </w:rPr>
+        <w:t>на</w:t>
+      </w:r>
+      <w:proofErr w:type="spellEnd"/>
+      <w:r>
+        <w:rPr>
+          <w:lang w:val="en-US"/>
+        </w:rPr>
+        <w:t xml:space="preserve"> </w:t>
+      </w:r>
+      <w:proofErr w:type="spellStart"/>
+      <w:r>
+        <w:rPr>
+          <w:lang w:val="en-US"/>
+        </w:rPr>
+        <w:t>разных</w:t>
+      </w:r>
+      <w:proofErr w:type="spellEnd"/>
+      <w:r>
+        <w:rPr>
+          <w:lang w:val="en-US"/>
+        </w:rPr>
+        <w:t xml:space="preserve"> </w:t>
+      </w:r>
+      <w:proofErr w:type="spellStart"/>
+      <w:r>
+        <w:rPr>
+          <w:lang w:val="en-US"/>
+        </w:rPr>
+        <w:t>машинах</w:t>
+      </w:r>
+      <w:proofErr w:type="spellEnd"/>
+      <w:r>
+        <w:rPr>
+          <w:lang w:val="en-US"/>
+        </w:rPr>
+        <w:t xml:space="preserve"> — </w:t>
+      </w:r>
+      <w:proofErr w:type="spellStart"/>
+      <w:r>
+        <w:rPr>
+          <w:lang w:val="en-US"/>
+        </w:rPr>
+        <w:t>это</w:t>
+      </w:r>
+      <w:proofErr w:type="spellEnd"/>
+      <w:r>
+        <w:rPr>
+          <w:lang w:val="en-US"/>
+        </w:rPr>
+        <w:t xml:space="preserve"> pure content (§14.1), </w:t>
+      </w:r>
+      <w:proofErr w:type="spellStart"/>
+      <w:r>
+        <w:rPr>
+          <w:lang w:val="en-US"/>
+        </w:rPr>
+        <w:t>позже</w:t>
+      </w:r>
+      <w:proofErr w:type="spellEnd"/>
+      <w:r>
+        <w:rPr>
+          <w:lang w:val="en-US"/>
+        </w:rPr>
+        <w:t xml:space="preserve"> </w:t>
+      </w:r>
+      <w:proofErr w:type="spellStart"/>
+      <w:r>
+        <w:rPr>
+          <w:lang w:val="en-US"/>
+        </w:rPr>
+        <w:t>без</w:t>
+      </w:r>
+      <w:proofErr w:type="spellEnd"/>
+      <w:r>
+        <w:rPr>
+          <w:lang w:val="en-US"/>
+        </w:rPr>
+        <w:t xml:space="preserve"> </w:t>
+      </w:r>
+      <w:proofErr w:type="spellStart"/>
+      <w:r>
+        <w:rPr>
+          <w:lang w:val="en-US"/>
+        </w:rPr>
+        <w:t>кода</w:t>
+      </w:r>
+      <w:proofErr w:type="spellEnd"/>
+      <w:r>
+        <w:rPr>
+          <w:lang w:val="en-US"/>
+        </w:rPr>
+        <w:t>.</w:t>
+      </w:r>
+    </w:p>
+    <w:p>
+      <w:pPr>
+        <w:rPr>
+          <w:lang w:val="en-US"/>
+        </w:rPr>
+      </w:pPr>
+    </w:p>
+    <w:p>
+      <w:pPr>
+        <w:rPr>
+          <w:lang w:val="en-US"/>
+        </w:rPr>
+      </w:pPr>
+      <w:r>
+        <w:rPr>
+          <w:lang w:val="en-US"/>
+        </w:rPr>
+        <w:t xml:space="preserve">3. </w:t>
+      </w:r>
+      <w:proofErr w:type="spellStart"/>
+      <w:r>
+        <w:rPr>
+          <w:lang w:val="en-US"/>
+        </w:rPr>
+        <w:t>Нюанс</w:t>
+      </w:r>
+      <w:proofErr w:type="spellEnd"/>
+      <w:r>
+        <w:rPr>
+          <w:lang w:val="en-US"/>
+        </w:rPr>
+        <w:t xml:space="preserve"> </w:t>
+      </w:r>
+      <w:proofErr w:type="spellStart"/>
+      <w:r>
+        <w:rPr>
+          <w:lang w:val="en-US"/>
+        </w:rPr>
+        <w:t>по</w:t>
+      </w:r>
+      <w:proofErr w:type="spellEnd"/>
+      <w:r>
+        <w:rPr>
+          <w:lang w:val="en-US"/>
+        </w:rPr>
+        <w:t xml:space="preserve"> </w:t>
+      </w:r>
+      <w:proofErr w:type="spellStart"/>
+      <w:r>
+        <w:rPr>
+          <w:lang w:val="en-US"/>
+        </w:rPr>
+        <w:t>папке</w:t>
+      </w:r>
+      <w:proofErr w:type="spellEnd"/>
+      <w:r>
+        <w:rPr>
+          <w:lang w:val="en-US"/>
+        </w:rPr>
+        <w:t xml:space="preserve">: Assets/Content/ </w:t>
+      </w:r>
+      <w:proofErr w:type="spellStart"/>
+      <w:r>
+        <w:rPr>
+          <w:lang w:val="en-US"/>
+        </w:rPr>
+        <w:t>не</w:t>
+      </w:r>
+      <w:proofErr w:type="spellEnd"/>
+      <w:r>
+        <w:rPr>
+          <w:lang w:val="en-US"/>
+        </w:rPr>
+        <w:t xml:space="preserve"> </w:t>
+      </w:r>
+      <w:proofErr w:type="spellStart"/>
+      <w:r>
+        <w:rPr>
+          <w:lang w:val="en-US"/>
+        </w:rPr>
+        <w:t>предусмотрена</w:t>
+      </w:r>
+      <w:proofErr w:type="spellEnd"/>
+      <w:r>
+        <w:rPr>
+          <w:lang w:val="en-US"/>
+        </w:rPr>
+        <w:t xml:space="preserve"> </w:t>
+      </w:r>
+      <w:proofErr w:type="spellStart"/>
+      <w:r>
+        <w:rPr>
+          <w:lang w:val="en-US"/>
+        </w:rPr>
+        <w:t>правилами</w:t>
+      </w:r>
+      <w:proofErr w:type="spellEnd"/>
+      <w:r>
+        <w:rPr>
+          <w:lang w:val="en-US"/>
+        </w:rPr>
+        <w:t xml:space="preserve"> </w:t>
+      </w:r>
+      <w:proofErr w:type="spellStart"/>
+      <w:r>
+        <w:rPr>
+          <w:lang w:val="en-US"/>
+        </w:rPr>
+        <w:t>хранения</w:t>
+      </w:r>
+      <w:proofErr w:type="spellEnd"/>
+      <w:r>
+        <w:rPr>
+          <w:lang w:val="en-US"/>
+        </w:rPr>
+        <w:t xml:space="preserve"> (</w:t>
+      </w:r>
+      <w:proofErr w:type="spellStart"/>
+      <w:r>
+        <w:rPr>
+          <w:lang w:val="en-US"/>
+        </w:rPr>
+        <w:t>наш</w:t>
+      </w:r>
+      <w:proofErr w:type="spellEnd"/>
+      <w:r>
+        <w:rPr>
+          <w:lang w:val="en-US"/>
+        </w:rPr>
+        <w:t xml:space="preserve"> </w:t>
+      </w:r>
+      <w:proofErr w:type="spellStart"/>
+      <w:r>
+        <w:rPr>
+          <w:lang w:val="en-US"/>
+        </w:rPr>
+        <w:t>контент</w:t>
+      </w:r>
+      <w:proofErr w:type="spellEnd"/>
+      <w:r>
+        <w:rPr>
+          <w:lang w:val="en-US"/>
+        </w:rPr>
+        <w:t xml:space="preserve"> → Development/, </w:t>
+      </w:r>
+      <w:proofErr w:type="spellStart"/>
+      <w:r>
+        <w:rPr>
+          <w:lang w:val="en-US"/>
+        </w:rPr>
+        <w:t>покупной</w:t>
+      </w:r>
+      <w:proofErr w:type="spellEnd"/>
+      <w:r>
+        <w:rPr>
+          <w:lang w:val="en-US"/>
+        </w:rPr>
+        <w:t xml:space="preserve"> → </w:t>
+      </w:r>
+      <w:proofErr w:type="spellStart"/>
+      <w:r>
+        <w:rPr>
+          <w:lang w:val="en-US"/>
+        </w:rPr>
+        <w:t>ThirdParty</w:t>
+      </w:r>
+      <w:proofErr w:type="spellEnd"/>
+      <w:r>
+        <w:rPr>
+          <w:lang w:val="en-US"/>
+        </w:rPr>
+        <w:t xml:space="preserve">/). </w:t>
+      </w:r>
+      <w:proofErr w:type="spellStart"/>
+      <w:r>
+        <w:rPr>
+          <w:lang w:val="en-US"/>
+        </w:rPr>
+        <w:t>Клип</w:t>
+      </w:r>
+      <w:proofErr w:type="spellEnd"/>
+      <w:r>
+        <w:rPr>
+          <w:lang w:val="en-US"/>
+        </w:rPr>
+        <w:t xml:space="preserve"> </w:t>
+      </w:r>
+      <w:proofErr w:type="spellStart"/>
+      <w:r>
+        <w:rPr>
+          <w:lang w:val="en-US"/>
+        </w:rPr>
+        <w:t>SitDriver.anim</w:t>
+      </w:r>
+      <w:proofErr w:type="spellEnd"/>
+      <w:r>
+        <w:rPr>
+          <w:lang w:val="en-US"/>
+        </w:rPr>
+        <w:t xml:space="preserve"> </w:t>
+      </w:r>
+      <w:proofErr w:type="spellStart"/>
+      <w:r>
+        <w:rPr>
+          <w:lang w:val="en-US"/>
+        </w:rPr>
+        <w:t>предлагаю</w:t>
+      </w:r>
+      <w:proofErr w:type="spellEnd"/>
+      <w:r>
+        <w:rPr>
+          <w:lang w:val="en-US"/>
+        </w:rPr>
+        <w:t xml:space="preserve"> editor-</w:t>
+      </w:r>
+      <w:proofErr w:type="spellStart"/>
+      <w:r>
+        <w:rPr>
+          <w:lang w:val="en-US"/>
+        </w:rPr>
+        <w:t>скриптом</w:t>
+      </w:r>
+      <w:proofErr w:type="spellEnd"/>
+      <w:r>
+        <w:rPr>
+          <w:lang w:val="en-US"/>
+        </w:rPr>
+        <w:t xml:space="preserve"> </w:t>
+      </w:r>
+      <w:proofErr w:type="spellStart"/>
+      <w:r>
+        <w:rPr>
+          <w:lang w:val="en-US"/>
+        </w:rPr>
+        <w:t>перенести</w:t>
+      </w:r>
+      <w:proofErr w:type="spellEnd"/>
+      <w:r>
+        <w:rPr>
+          <w:lang w:val="en-US"/>
+        </w:rPr>
+        <w:t xml:space="preserve"> </w:t>
+      </w:r>
+      <w:proofErr w:type="spellStart"/>
+      <w:r>
+        <w:rPr>
+          <w:lang w:val="en-US"/>
+        </w:rPr>
+        <w:t>через</w:t>
+      </w:r>
+      <w:proofErr w:type="spellEnd"/>
+      <w:r>
+        <w:rPr>
+          <w:lang w:val="en-US"/>
+        </w:rPr>
+        <w:t xml:space="preserve"> </w:t>
+      </w:r>
+      <w:proofErr w:type="spellStart"/>
+      <w:r>
+        <w:rPr>
+          <w:lang w:val="en-US"/>
+        </w:rPr>
+        <w:t>AssetDatabase.MoveAsset</w:t>
+      </w:r>
+      <w:proofErr w:type="spellEnd"/>
+      <w:r>
+        <w:rPr>
+          <w:lang w:val="en-US"/>
+        </w:rPr>
+        <w:t xml:space="preserve"> в Assets/Development/Art/Animations/ — GUID </w:t>
+      </w:r>
+      <w:proofErr w:type="spellStart"/>
+      <w:r>
+        <w:rPr>
+          <w:lang w:val="en-US"/>
+        </w:rPr>
+        <w:t>сохранится</w:t>
+      </w:r>
+      <w:proofErr w:type="spellEnd"/>
+      <w:r>
+        <w:rPr>
+          <w:lang w:val="en-US"/>
+        </w:rPr>
+        <w:t xml:space="preserve">, </w:t>
+      </w:r>
+      <w:proofErr w:type="spellStart"/>
+      <w:r>
+        <w:rPr>
+          <w:lang w:val="en-US"/>
+        </w:rPr>
+        <w:t>ссылки</w:t>
+      </w:r>
+      <w:proofErr w:type="spellEnd"/>
+      <w:r>
+        <w:rPr>
+          <w:lang w:val="en-US"/>
+        </w:rPr>
+        <w:t xml:space="preserve"> </w:t>
+      </w:r>
+      <w:proofErr w:type="spellStart"/>
+      <w:r>
+        <w:rPr>
+          <w:lang w:val="en-US"/>
+        </w:rPr>
+        <w:t>не</w:t>
+      </w:r>
+      <w:proofErr w:type="spellEnd"/>
+      <w:r>
+        <w:rPr>
+          <w:lang w:val="en-US"/>
+        </w:rPr>
+        <w:t xml:space="preserve"> </w:t>
+      </w:r>
+      <w:proofErr w:type="spellStart"/>
+      <w:r>
+        <w:rPr>
+          <w:lang w:val="en-US"/>
+        </w:rPr>
+        <w:t>сломаются</w:t>
+      </w:r>
+      <w:proofErr w:type="spellEnd"/>
+      <w:r>
+        <w:rPr>
+          <w:lang w:val="en-US"/>
+        </w:rPr>
+        <w:t xml:space="preserve">. </w:t>
+      </w:r>
+      <w:proofErr w:type="spellStart"/>
+      <w:r>
+        <w:rPr>
+          <w:lang w:val="en-US"/>
+        </w:rPr>
+        <w:t>Включил</w:t>
+      </w:r>
+      <w:proofErr w:type="spellEnd"/>
+      <w:r>
+        <w:rPr>
+          <w:lang w:val="en-US"/>
+        </w:rPr>
+        <w:t xml:space="preserve"> </w:t>
+      </w:r>
+      <w:proofErr w:type="spellStart"/>
+      <w:r>
+        <w:rPr>
+          <w:lang w:val="en-US"/>
+        </w:rPr>
+        <w:t>это</w:t>
+      </w:r>
+      <w:proofErr w:type="spellEnd"/>
+      <w:r>
+        <w:rPr>
+          <w:lang w:val="en-US"/>
+        </w:rPr>
+        <w:t xml:space="preserve"> в п.14 </w:t>
+      </w:r>
+      <w:proofErr w:type="spellStart"/>
+      <w:r>
+        <w:rPr>
+          <w:lang w:val="en-US"/>
+        </w:rPr>
+        <w:t>как</w:t>
+      </w:r>
+      <w:proofErr w:type="spellEnd"/>
+      <w:r>
+        <w:rPr>
+          <w:lang w:val="en-US"/>
+        </w:rPr>
+        <w:t xml:space="preserve"> </w:t>
+      </w:r>
+      <w:proofErr w:type="spellStart"/>
+      <w:r>
+        <w:rPr>
+          <w:lang w:val="en-US"/>
+        </w:rPr>
+        <w:t>идемпотентный</w:t>
+      </w:r>
+      <w:proofErr w:type="spellEnd"/>
+      <w:r>
+        <w:rPr>
+          <w:lang w:val="en-US"/>
+        </w:rPr>
+        <w:t xml:space="preserve"> </w:t>
+      </w:r>
+      <w:proofErr w:type="spellStart"/>
+      <w:r>
+        <w:rPr>
+          <w:lang w:val="en-US"/>
+        </w:rPr>
+        <w:t>первый</w:t>
+      </w:r>
+      <w:proofErr w:type="spellEnd"/>
+      <w:r>
+        <w:rPr>
+          <w:lang w:val="en-US"/>
+        </w:rPr>
+        <w:t xml:space="preserve"> </w:t>
+      </w:r>
+      <w:proofErr w:type="spellStart"/>
+      <w:r>
+        <w:rPr>
+          <w:lang w:val="en-US"/>
+        </w:rPr>
+        <w:t>шаг</w:t>
+      </w:r>
+      <w:proofErr w:type="spellEnd"/>
+      <w:r>
+        <w:rPr>
+          <w:lang w:val="en-US"/>
+        </w:rPr>
+        <w:t>.</w:t>
+      </w:r>
+    </w:p>
+    <w:p>
+      <w:pPr>
+        <w:rPr>
+          <w:lang w:val="en-US"/>
+        </w:rPr>
+      </w:pPr>
+    </w:p>
+    <w:p>
+      <w:pPr>
+        <w:rPr>
+          <w:lang w:val="en-US"/>
+        </w:rPr>
+      </w:pPr>
+      <w:proofErr w:type="spellStart"/>
+      <w:r>
+        <w:rPr>
+          <w:lang w:val="en-US"/>
+        </w:rPr>
+        <w:t>Остальное</w:t>
+      </w:r>
+      <w:proofErr w:type="spellEnd"/>
+      <w:r>
+        <w:rPr>
+          <w:lang w:val="en-US"/>
+        </w:rPr>
+        <w:t xml:space="preserve"> — </w:t>
+      </w:r>
+      <w:proofErr w:type="spellStart"/>
+      <w:r>
+        <w:rPr>
+          <w:lang w:val="en-US"/>
+        </w:rPr>
+        <w:t>без</w:t>
+      </w:r>
+      <w:proofErr w:type="spellEnd"/>
+      <w:r>
+        <w:rPr>
+          <w:lang w:val="en-US"/>
+        </w:rPr>
+        <w:t xml:space="preserve"> </w:t>
+      </w:r>
+      <w:proofErr w:type="spellStart"/>
+      <w:r>
+        <w:rPr>
+          <w:lang w:val="en-US"/>
+        </w:rPr>
+        <w:t>изменений</w:t>
+      </w:r>
+      <w:proofErr w:type="spellEnd"/>
+      <w:r>
+        <w:rPr>
+          <w:lang w:val="en-US"/>
+        </w:rPr>
+        <w:t xml:space="preserve">: </w:t>
+      </w:r>
+      <w:proofErr w:type="spellStart"/>
+      <w:r>
+        <w:rPr>
+          <w:lang w:val="en-US"/>
+        </w:rPr>
+        <w:t>ICommand</w:t>
+      </w:r>
+      <w:proofErr w:type="spellEnd"/>
+      <w:r>
+        <w:rPr>
+          <w:lang w:val="en-US"/>
+        </w:rPr>
+        <w:t xml:space="preserve"> + </w:t>
+      </w:r>
+      <w:proofErr w:type="spellStart"/>
+      <w:r>
+        <w:rPr>
+          <w:lang w:val="en-US"/>
+        </w:rPr>
+        <w:t>EjectCommand</w:t>
+      </w:r>
+      <w:proofErr w:type="spellEnd"/>
+      <w:r>
+        <w:rPr>
+          <w:lang w:val="en-US"/>
+        </w:rPr>
+        <w:t xml:space="preserve"> (</w:t>
+      </w:r>
+      <w:proofErr w:type="spellStart"/>
+      <w:r>
+        <w:rPr>
+          <w:lang w:val="en-US"/>
+        </w:rPr>
+        <w:t>инфраструктура</w:t>
+      </w:r>
+      <w:proofErr w:type="spellEnd"/>
+      <w:r>
+        <w:rPr>
+          <w:lang w:val="en-US"/>
+        </w:rPr>
+        <w:t xml:space="preserve"> </w:t>
+      </w:r>
+      <w:proofErr w:type="spellStart"/>
+      <w:r>
+        <w:rPr>
+          <w:lang w:val="en-US"/>
+        </w:rPr>
+        <w:t>команд</w:t>
+      </w:r>
+      <w:proofErr w:type="spellEnd"/>
+      <w:r>
+        <w:rPr>
+          <w:lang w:val="en-US"/>
+        </w:rPr>
+        <w:t xml:space="preserve"> </w:t>
+      </w:r>
+      <w:proofErr w:type="spellStart"/>
+      <w:r>
+        <w:rPr>
+          <w:lang w:val="en-US"/>
+        </w:rPr>
+        <w:t>создаётся</w:t>
+      </w:r>
+      <w:proofErr w:type="spellEnd"/>
+      <w:r>
+        <w:rPr>
+          <w:lang w:val="en-US"/>
+        </w:rPr>
+        <w:t xml:space="preserve"> </w:t>
+      </w:r>
+      <w:proofErr w:type="spellStart"/>
+      <w:r>
+        <w:rPr>
+          <w:lang w:val="en-US"/>
+        </w:rPr>
+        <w:t>впервые</w:t>
+      </w:r>
+      <w:proofErr w:type="spellEnd"/>
+      <w:r>
+        <w:rPr>
+          <w:lang w:val="en-US"/>
+        </w:rPr>
+        <w:t xml:space="preserve">), </w:t>
+      </w:r>
+      <w:proofErr w:type="spellStart"/>
+      <w:r>
+        <w:rPr>
+          <w:lang w:val="en-US"/>
+        </w:rPr>
+        <w:t>Events.Stunts.cs</w:t>
+      </w:r>
+      <w:proofErr w:type="spellEnd"/>
+      <w:r>
+        <w:rPr>
+          <w:lang w:val="en-US"/>
+        </w:rPr>
+        <w:t xml:space="preserve"> + </w:t>
+      </w:r>
+      <w:proofErr w:type="spellStart"/>
+      <w:r>
+        <w:rPr>
+          <w:lang w:val="en-US"/>
+        </w:rPr>
+        <w:t>EjectReason</w:t>
+      </w:r>
+      <w:proofErr w:type="spellEnd"/>
+      <w:r>
+        <w:rPr>
+          <w:lang w:val="en-US"/>
+        </w:rPr>
+        <w:t xml:space="preserve">, eject у </w:t>
+      </w:r>
+      <w:proofErr w:type="spellStart"/>
+      <w:r>
+        <w:rPr>
+          <w:lang w:val="en-US"/>
+        </w:rPr>
+        <w:t>всех</w:t>
+      </w:r>
+      <w:proofErr w:type="spellEnd"/>
+      <w:r>
+        <w:rPr>
+          <w:lang w:val="en-US"/>
+        </w:rPr>
+        <w:t xml:space="preserve"> </w:t>
+      </w:r>
+      <w:proofErr w:type="spellStart"/>
+      <w:r>
+        <w:rPr>
+          <w:lang w:val="en-US"/>
+        </w:rPr>
+        <w:t>машин</w:t>
+      </w:r>
+      <w:proofErr w:type="spellEnd"/>
+      <w:r>
+        <w:rPr>
+          <w:lang w:val="en-US"/>
+        </w:rPr>
+        <w:t xml:space="preserve"> </w:t>
+      </w:r>
+      <w:proofErr w:type="spellStart"/>
+      <w:r>
+        <w:rPr>
+          <w:lang w:val="en-US"/>
+        </w:rPr>
+        <w:t>при</w:t>
+      </w:r>
+      <w:proofErr w:type="spellEnd"/>
+      <w:r>
+        <w:rPr>
+          <w:lang w:val="en-US"/>
+        </w:rPr>
+        <w:t xml:space="preserve"> wreck, ICameraBehaviour/CameraRig/OrbitDriverCameraBehaviour/CameraService (pure C#, </w:t>
+      </w:r>
+      <w:proofErr w:type="spellStart"/>
+      <w:r>
+        <w:rPr>
+          <w:lang w:val="en-US"/>
+        </w:rPr>
+        <w:t>слушает</w:t>
+      </w:r>
+      <w:proofErr w:type="spellEnd"/>
+      <w:r>
+        <w:rPr>
+          <w:lang w:val="en-US"/>
+        </w:rPr>
+        <w:t xml:space="preserve"> </w:t>
+      </w:r>
+      <w:proofErr w:type="spellStart"/>
+      <w:r>
+        <w:rPr>
+          <w:lang w:val="en-US"/>
+        </w:rPr>
+        <w:t>GameStateChangedEvent</w:t>
+      </w:r>
+      <w:proofErr w:type="spellEnd"/>
+      <w:r>
+        <w:rPr>
+          <w:lang w:val="en-US"/>
+        </w:rPr>
+        <w:t xml:space="preserve"> + </w:t>
+      </w:r>
+      <w:proofErr w:type="spellStart"/>
+      <w:r>
+        <w:rPr>
+          <w:lang w:val="en-US"/>
+        </w:rPr>
+        <w:t>DriverEjectedEvent</w:t>
+      </w:r>
+      <w:proofErr w:type="spellEnd"/>
+      <w:r>
+        <w:rPr>
+          <w:lang w:val="en-US"/>
+        </w:rPr>
+        <w:t xml:space="preserve"> </w:t>
+      </w:r>
+      <w:proofErr w:type="spellStart"/>
+      <w:r>
+        <w:rPr>
+          <w:lang w:val="en-US"/>
+        </w:rPr>
+        <w:t>игрока</w:t>
+      </w:r>
+      <w:proofErr w:type="spellEnd"/>
+      <w:r>
+        <w:rPr>
+          <w:lang w:val="en-US"/>
+        </w:rPr>
+        <w:t xml:space="preserve"> → </w:t>
+      </w:r>
+      <w:proofErr w:type="spellStart"/>
+      <w:r>
+        <w:rPr>
+          <w:lang w:val="en-US"/>
+        </w:rPr>
+        <w:t>орбита</w:t>
+      </w:r>
+      <w:proofErr w:type="spellEnd"/>
+      <w:r>
+        <w:rPr>
+          <w:lang w:val="en-US"/>
+        </w:rPr>
+        <w:t xml:space="preserve"> </w:t>
+      </w:r>
+      <w:proofErr w:type="spellStart"/>
+      <w:r>
+        <w:rPr>
+          <w:lang w:val="en-US"/>
+        </w:rPr>
+        <w:t>за</w:t>
+      </w:r>
+      <w:proofErr w:type="spellEnd"/>
+      <w:r>
+        <w:rPr>
+          <w:lang w:val="en-US"/>
+        </w:rPr>
+        <w:t xml:space="preserve"> </w:t>
+      </w:r>
+      <w:proofErr w:type="spellStart"/>
+      <w:r>
+        <w:rPr>
+          <w:lang w:val="en-US"/>
+        </w:rPr>
+        <w:t>ragdoll'ом</w:t>
+      </w:r>
+      <w:proofErr w:type="spellEnd"/>
+      <w:r>
+        <w:rPr>
+          <w:lang w:val="en-US"/>
+        </w:rPr>
+        <w:t xml:space="preserve"> </w:t>
+      </w:r>
+      <w:proofErr w:type="spellStart"/>
+      <w:r>
+        <w:rPr>
+          <w:lang w:val="en-US"/>
+        </w:rPr>
+        <w:t>до</w:t>
+      </w:r>
+      <w:proofErr w:type="spellEnd"/>
+      <w:r>
+        <w:rPr>
+          <w:lang w:val="en-US"/>
+        </w:rPr>
+        <w:t xml:space="preserve"> </w:t>
+      </w:r>
+      <w:proofErr w:type="spellStart"/>
+      <w:r>
+        <w:rPr>
+          <w:lang w:val="en-US"/>
+        </w:rPr>
+        <w:t>MatchEnd</w:t>
+      </w:r>
+      <w:proofErr w:type="spellEnd"/>
+      <w:r>
+        <w:rPr>
+          <w:lang w:val="en-US"/>
+        </w:rPr>
+        <w:t xml:space="preserve">), </w:t>
+      </w:r>
+      <w:proofErr w:type="spellStart"/>
+      <w:r>
+        <w:rPr>
+          <w:lang w:val="en-US"/>
+        </w:rPr>
+        <w:t>регистрация</w:t>
+      </w:r>
+      <w:proofErr w:type="spellEnd"/>
+      <w:r>
+        <w:rPr>
+          <w:lang w:val="en-US"/>
+        </w:rPr>
+        <w:t xml:space="preserve"> в </w:t>
+      </w:r>
+      <w:proofErr w:type="spellStart"/>
+      <w:r>
+        <w:rPr>
+          <w:lang w:val="en-US"/>
+        </w:rPr>
+        <w:t>GameLifetimeScope</w:t>
+      </w:r>
+      <w:proofErr w:type="spellEnd"/>
+      <w:r>
+        <w:rPr>
+          <w:lang w:val="en-US"/>
+        </w:rPr>
+        <w:t>, editor-</w:t>
+      </w:r>
+      <w:proofErr w:type="spellStart"/>
+      <w:r>
+        <w:rPr>
+          <w:lang w:val="en-US"/>
+        </w:rPr>
+        <w:t>скрипты</w:t>
+      </w:r>
+      <w:proofErr w:type="spellEnd"/>
+      <w:r>
+        <w:rPr>
+          <w:lang w:val="en-US"/>
+        </w:rPr>
+        <w:t xml:space="preserve"> «Attach Driver To Car Prefabs» / «Create Default </w:t>
+      </w:r>
+      <w:proofErr w:type="spellStart"/>
+      <w:r>
+        <w:rPr>
+          <w:lang w:val="en-US"/>
+        </w:rPr>
+        <w:t>DriverEjectConfig</w:t>
+      </w:r>
+      <w:proofErr w:type="spellEnd"/>
+      <w:r>
+        <w:rPr>
+          <w:lang w:val="en-US"/>
+        </w:rPr>
+        <w:t xml:space="preserve"> + </w:t>
+      </w:r>
+      <w:proofErr w:type="spellStart"/>
+      <w:r>
+        <w:rPr>
+          <w:lang w:val="en-US"/>
+        </w:rPr>
+        <w:t>OrbitCameraConfig</w:t>
+      </w:r>
+      <w:proofErr w:type="spellEnd"/>
+      <w:r>
+        <w:rPr>
+          <w:lang w:val="en-US"/>
+        </w:rPr>
+        <w:t xml:space="preserve">» / </w:t>
+      </w:r>
+      <w:proofErr w:type="spellStart"/>
+      <w:r>
+        <w:rPr>
+          <w:lang w:val="en-US"/>
+        </w:rPr>
+        <w:t>обновление</w:t>
+      </w:r>
+      <w:proofErr w:type="spellEnd"/>
+      <w:r>
+        <w:rPr>
+          <w:lang w:val="en-US"/>
+        </w:rPr>
+        <w:t xml:space="preserve"> «Fill </w:t>
+      </w:r>
+      <w:proofErr w:type="spellStart"/>
+      <w:r>
+        <w:rPr>
+          <w:lang w:val="en-US"/>
+        </w:rPr>
+        <w:t>GameLifetimeScope</w:t>
+      </w:r>
+      <w:proofErr w:type="spellEnd"/>
+      <w:r>
+        <w:rPr>
+          <w:lang w:val="en-US"/>
+        </w:rPr>
+        <w:t xml:space="preserve"> Refs», </w:t>
+      </w:r>
+      <w:proofErr w:type="spellStart"/>
+      <w:r>
+        <w:rPr>
+          <w:lang w:val="en-US"/>
+        </w:rPr>
+        <w:t>тесты</w:t>
+      </w:r>
+      <w:proofErr w:type="spellEnd"/>
+      <w:r>
+        <w:rPr>
+          <w:lang w:val="en-US"/>
+        </w:rPr>
+        <w:t xml:space="preserve"> </w:t>
+      </w:r>
+      <w:proofErr w:type="spellStart"/>
+      <w:r>
+        <w:rPr>
+          <w:lang w:val="en-US"/>
+        </w:rPr>
+        <w:t>CameraServiceTests</w:t>
+      </w:r>
+      <w:proofErr w:type="spellEnd"/>
+      <w:r>
+        <w:rPr>
+          <w:lang w:val="en-US"/>
+        </w:rPr>
+        <w:t>.</w:t>
+      </w:r>
+    </w:p>
+    <w:p>
+      <w:pPr>
+        <w:rPr>
+          <w:lang w:val="en-US"/>
+        </w:rPr>
+      </w:pPr>
+    </w:p>
+    <w:p>
+      <w:pPr>
+        <w:rPr>
+          <w:lang w:val="en-US"/>
+        </w:rPr>
+      </w:pPr>
+    </w:p>
+    <w:p>
+      <w:pPr>
         <w:rPr>
           <w:lang w:val="en-US"/>
         </w:rPr>
@@ -18263,6 +20809,7 @@
         <w:rPr>
           <w:lang w:val="en-US"/>
         </w:rPr>
+        <w:lastRenderedPageBreak/>
         <w:t>step</w:t>
       </w:r>
       <w:r>

</xml_diff>

<commit_message>
Шаг 7 (High Jump)
</commit_message>
<xml_diff>
--- a/docs/архитектура с первого шага.docx
+++ b/docs/архитектура с первого шага.docx
@@ -20726,33 +20726,336 @@
       </w:r>
     </w:p>
     <w:p/>
+    <w:p>
+      <w:pPr>
+        <w:pStyle w:val="3"/>
+        <w:rPr>
+          <w:lang w:val="en-US"/>
+        </w:rPr>
+      </w:pPr>
+      <w:r>
+        <w:t>План</w:t>
+      </w:r>
+      <w:r>
+        <w:rPr>
+          <w:lang w:val="en-US"/>
+        </w:rPr>
+        <w:t xml:space="preserve"> </w:t>
+      </w:r>
+      <w:r>
+        <w:t>файлов</w:t>
+      </w:r>
+      <w:r>
+        <w:rPr>
+          <w:lang w:val="en-US"/>
+        </w:rPr>
+        <w:t xml:space="preserve"> — </w:t>
+      </w:r>
+      <w:r>
+        <w:t>шаг</w:t>
+      </w:r>
+      <w:r>
+        <w:rPr>
+          <w:lang w:val="en-US"/>
+        </w:rPr>
+        <w:t xml:space="preserve"> 7 «Stunts: High Jump»</w:t>
+      </w:r>
+    </w:p>
+    <w:p>
+      <w:pPr>
+        <w:rPr>
+          <w:lang w:val="en-US"/>
+        </w:rPr>
+      </w:pPr>
+    </w:p>
+    <w:p>
+      <w:pPr>
+        <w:rPr>
+          <w:lang w:val="en-US"/>
+        </w:rPr>
+      </w:pPr>
+      <w:r>
+        <w:lastRenderedPageBreak/>
+        <w:t xml:space="preserve">Решения учтены: рекорд в </w:t>
+      </w:r>
+      <w:proofErr w:type="spellStart"/>
+      <w:r>
+        <w:t>PlayerPrefs</w:t>
+      </w:r>
+      <w:proofErr w:type="spellEnd"/>
+      <w:r>
+        <w:t xml:space="preserve"> сейчас; временный текст + R-рестарт (рестарт = перезагрузка сцены — самый дешёвый честный сброс </w:t>
+      </w:r>
+      <w:proofErr w:type="spellStart"/>
+      <w:r>
+        <w:t>ragdoll'а</w:t>
+      </w:r>
+      <w:proofErr w:type="spellEnd"/>
+      <w:r>
+        <w:t xml:space="preserve"> и машины).</w:t>
+      </w:r>
+    </w:p>
+    <w:p>
+      <w:pPr>
+        <w:rPr>
+          <w:lang w:val="en-US"/>
+        </w:rPr>
+      </w:pPr>
+      <w:r>
+        <w:rPr>
+          <w:noProof/>
+        </w:rPr>
+        <w:drawing>
+          <wp:inline distT="0" distB="0" distL="0" distR="0" wp14:anchorId="1987B7CE" wp14:editId="5DB6AE56">
+            <wp:extent cx="6558539" cy="1452623"/>
+            <wp:effectExtent l="0" t="0" r="0" b="0"/>
+            <wp:docPr id="749544111" name="Рисунок 1"/>
+            <wp:cNvGraphicFramePr>
+              <a:graphicFrameLocks xmlns:a="http://schemas.openxmlformats.org/drawingml/2006/main" noChangeAspect="1"/>
+            </wp:cNvGraphicFramePr>
+            <a:graphic xmlns:a="http://schemas.openxmlformats.org/drawingml/2006/main">
+              <a:graphicData uri="http://schemas.openxmlformats.org/drawingml/2006/picture">
+                <pic:pic xmlns:pic="http://schemas.openxmlformats.org/drawingml/2006/picture">
+                  <pic:nvPicPr>
+                    <pic:cNvPr id="749544111" name=""/>
+                    <pic:cNvPicPr/>
+                  </pic:nvPicPr>
+                  <pic:blipFill>
+                    <a:blip r:embed="rId14"/>
+                    <a:stretch>
+                      <a:fillRect/>
+                    </a:stretch>
+                  </pic:blipFill>
+                  <pic:spPr>
+                    <a:xfrm>
+                      <a:off x="0" y="0"/>
+                      <a:ext cx="6580144" cy="1457408"/>
+                    </a:xfrm>
+                    <a:prstGeom prst="rect">
+                      <a:avLst/>
+                    </a:prstGeom>
+                  </pic:spPr>
+                </pic:pic>
+              </a:graphicData>
+            </a:graphic>
+          </wp:inline>
+        </w:drawing>
+      </w:r>
+    </w:p>
+    <w:p>
+      <w:r>
+        <w:rPr>
+          <w:noProof/>
+        </w:rPr>
+        <w:drawing>
+          <wp:inline distT="0" distB="0" distL="0" distR="0" wp14:anchorId="0540EDE7" wp14:editId="37DC6A0B">
+            <wp:extent cx="6534207" cy="1579944"/>
+            <wp:effectExtent l="0" t="0" r="0" b="1270"/>
+            <wp:docPr id="1993699578" name="Рисунок 1"/>
+            <wp:cNvGraphicFramePr>
+              <a:graphicFrameLocks xmlns:a="http://schemas.openxmlformats.org/drawingml/2006/main" noChangeAspect="1"/>
+            </wp:cNvGraphicFramePr>
+            <a:graphic xmlns:a="http://schemas.openxmlformats.org/drawingml/2006/main">
+              <a:graphicData uri="http://schemas.openxmlformats.org/drawingml/2006/picture">
+                <pic:pic xmlns:pic="http://schemas.openxmlformats.org/drawingml/2006/picture">
+                  <pic:nvPicPr>
+                    <pic:cNvPr id="1993699578" name=""/>
+                    <pic:cNvPicPr/>
+                  </pic:nvPicPr>
+                  <pic:blipFill>
+                    <a:blip r:embed="rId15"/>
+                    <a:stretch>
+                      <a:fillRect/>
+                    </a:stretch>
+                  </pic:blipFill>
+                  <pic:spPr>
+                    <a:xfrm>
+                      <a:off x="0" y="0"/>
+                      <a:ext cx="6545994" cy="1582794"/>
+                    </a:xfrm>
+                    <a:prstGeom prst="rect">
+                      <a:avLst/>
+                    </a:prstGeom>
+                  </pic:spPr>
+                </pic:pic>
+              </a:graphicData>
+            </a:graphic>
+          </wp:inline>
+        </w:drawing>
+      </w:r>
+    </w:p>
+    <w:p>
+      <w:r>
+        <w:rPr>
+          <w:noProof/>
+        </w:rPr>
+        <w:drawing>
+          <wp:inline distT="0" distB="0" distL="0" distR="0" wp14:anchorId="25ED87F5" wp14:editId="2C199A31">
+            <wp:extent cx="6506802" cy="1516283"/>
+            <wp:effectExtent l="0" t="0" r="0" b="8255"/>
+            <wp:docPr id="1450289501" name="Рисунок 1"/>
+            <wp:cNvGraphicFramePr>
+              <a:graphicFrameLocks xmlns:a="http://schemas.openxmlformats.org/drawingml/2006/main" noChangeAspect="1"/>
+            </wp:cNvGraphicFramePr>
+            <a:graphic xmlns:a="http://schemas.openxmlformats.org/drawingml/2006/main">
+              <a:graphicData uri="http://schemas.openxmlformats.org/drawingml/2006/picture">
+                <pic:pic xmlns:pic="http://schemas.openxmlformats.org/drawingml/2006/picture">
+                  <pic:nvPicPr>
+                    <pic:cNvPr id="1450289501" name=""/>
+                    <pic:cNvPicPr/>
+                  </pic:nvPicPr>
+                  <pic:blipFill>
+                    <a:blip r:embed="rId16"/>
+                    <a:stretch>
+                      <a:fillRect/>
+                    </a:stretch>
+                  </pic:blipFill>
+                  <pic:spPr>
+                    <a:xfrm>
+                      <a:off x="0" y="0"/>
+                      <a:ext cx="6554272" cy="1527345"/>
+                    </a:xfrm>
+                    <a:prstGeom prst="rect">
+                      <a:avLst/>
+                    </a:prstGeom>
+                  </pic:spPr>
+                </pic:pic>
+              </a:graphicData>
+            </a:graphic>
+          </wp:inline>
+        </w:drawing>
+      </w:r>
+    </w:p>
+    <w:p>
+      <w:r>
+        <w:t>TESTS</w:t>
+      </w:r>
+    </w:p>
     <w:p/>
     <w:p>
-      <w:pPr>
-        <w:rPr>
-          <w:lang w:val="en-US"/>
-        </w:rPr>
-      </w:pPr>
-    </w:p>
-    <w:p>
-      <w:pPr>
-        <w:rPr>
-          <w:lang w:val="en-US"/>
-        </w:rPr>
-      </w:pPr>
-    </w:p>
-    <w:p>
-      <w:pPr>
-        <w:rPr>
-          <w:lang w:val="en-US"/>
-        </w:rPr>
-      </w:pPr>
-      <w:r>
-        <w:rPr>
-          <w:lang w:val="en-US"/>
-        </w:rPr>
-        <w:t xml:space="preserve"> </w:t>
-      </w:r>
+      <w:proofErr w:type="spellStart"/>
+      <w:r>
+        <w:t>DriverFlightServiceTests</w:t>
+      </w:r>
+      <w:proofErr w:type="spellEnd"/>
+      <w:r>
+        <w:t xml:space="preserve"> (буст 1/попытку, штраф скорости, </w:t>
+      </w:r>
+      <w:proofErr w:type="spellStart"/>
+      <w:r>
+        <w:t>peak</w:t>
+      </w:r>
+      <w:proofErr w:type="spellEnd"/>
+      <w:r>
+        <w:t>/</w:t>
+      </w:r>
+      <w:proofErr w:type="spellStart"/>
+      <w:r>
+        <w:t>airtime</w:t>
+      </w:r>
+      <w:proofErr w:type="spellEnd"/>
+      <w:r>
+        <w:t xml:space="preserve">), </w:t>
+      </w:r>
+      <w:proofErr w:type="spellStart"/>
+      <w:r>
+        <w:t>FlipDetectorServiceTests</w:t>
+      </w:r>
+      <w:proofErr w:type="spellEnd"/>
+      <w:r>
+        <w:t xml:space="preserve"> (аккумуляция → счёт флипов, сброс), </w:t>
+      </w:r>
+      <w:proofErr w:type="spellStart"/>
+      <w:r>
+        <w:t>HighJumpScoreServiceTests</w:t>
+      </w:r>
+      <w:proofErr w:type="spellEnd"/>
+      <w:r>
+        <w:t xml:space="preserve"> (формула, рекорд, события), </w:t>
+      </w:r>
+      <w:proofErr w:type="spellStart"/>
+      <w:r>
+        <w:t>HighJumpSessionServiceTests</w:t>
+      </w:r>
+      <w:proofErr w:type="spellEnd"/>
+      <w:r>
+        <w:t xml:space="preserve"> (последовательность состояний через </w:t>
+      </w:r>
+      <w:proofErr w:type="spellStart"/>
+      <w:r>
+        <w:t>FakeGameFlowService</w:t>
+      </w:r>
+      <w:proofErr w:type="spellEnd"/>
+      <w:r>
+        <w:t xml:space="preserve"> — фейк уже есть в </w:t>
+      </w:r>
+      <w:proofErr w:type="spellStart"/>
+      <w:r>
+        <w:t>DerbyMatchServiceTests</w:t>
+      </w:r>
+      <w:proofErr w:type="spellEnd"/>
+      <w:r>
+        <w:t>).</w:t>
+      </w:r>
+    </w:p>
+    <w:p/>
+    <w:p>
+      <w:r>
+        <w:t>Отступления, зашитые в план (</w:t>
+      </w:r>
+      <w:r>
+        <w:rPr>
+          <w:rFonts w:ascii="Segoe UI Emoji" w:hAnsi="Segoe UI Emoji" w:cs="Segoe UI Emoji"/>
+        </w:rPr>
+        <w:t>⚠️</w:t>
+      </w:r>
+      <w:r>
+        <w:t xml:space="preserve"> выше)</w:t>
+      </w:r>
+    </w:p>
+    <w:p/>
+    <w:p>
+      <w:pPr>
+        <w:rPr>
+          <w:lang w:val="en-US"/>
+        </w:rPr>
+      </w:pPr>
+      <w:proofErr w:type="spellStart"/>
+      <w:r>
+        <w:t>HighJumpSessionService</w:t>
+      </w:r>
+      <w:proofErr w:type="spellEnd"/>
+      <w:r>
+        <w:t xml:space="preserve">, </w:t>
+      </w:r>
+      <w:proofErr w:type="spellStart"/>
+      <w:r>
+        <w:t>DriverFlightController</w:t>
+      </w:r>
+      <w:proofErr w:type="spellEnd"/>
+      <w:r>
+        <w:t xml:space="preserve"> и временный оверлей — сверх списка §12; причины в таблице. Декоративные </w:t>
+      </w:r>
+      <w:proofErr w:type="spellStart"/>
+      <w:r>
+        <w:t>measurement</w:t>
+      </w:r>
+      <w:proofErr w:type="spellEnd"/>
+      <w:r>
+        <w:t>-маркеры (§6) в v1 не делаю — чистый визуал, добавится за минуту позже.</w:t>
+      </w:r>
+    </w:p>
+    <w:p>
+      <w:r>
+        <w:t xml:space="preserve"> </w:t>
+      </w:r>
+    </w:p>
+    <w:p>
+      <w:pPr>
+        <w:rPr>
+          <w:lang w:val="en-US"/>
+        </w:rPr>
+      </w:pPr>
       <w:r>
         <w:t>В</w:t>
       </w:r>
@@ -21085,6 +21388,7 @@
         <w:rPr>
           <w:lang w:val="en-US"/>
         </w:rPr>
+        <w:lastRenderedPageBreak/>
         <w:t>step5-remaining-plan.md (</w:t>
       </w:r>
       <w:proofErr w:type="spellStart"/>

</xml_diff>